<commit_message>
Add project report and images
</commit_message>
<xml_diff>
--- a/Project_Report_Agentic_AI_Network_RCA_Updated.docx
+++ b/Project_Report_Agentic_AI_Network_RCA_Updated.docx
@@ -1975,14 +1975,38 @@
               <w:rPr/>
             </w:pPr>
             <w:r>
-              <w:rPr>
-                <w:rFonts w:eastAsia="Times New Roman" w:cs="Times New Roman"/>
-                <w:b/>
-                <w:bCs/>
-                <w:sz w:val="20"/>
-                <w:szCs w:val="20"/>
-              </w:rPr>
-              <w:t>Project Title</w:t>
+              <w:drawing>
+                <wp:inline xmlns:a="http://schemas.openxmlformats.org/drawingml/2006/main">
+                  <wp:extent cx="5303520" cy="4209926"/>
+                  <wp:docPr id="20" name="Picture 20"/>
+                  <wp:cNvGraphicFramePr>
+                    <a:graphicFrameLocks noChangeAspect="1"/>
+                  </wp:cNvGraphicFramePr>
+                  <a:graphic>
+                    <a:graphicData uri="http://schemas.openxmlformats.org/drawingml/2006/picture">
+                      <pic:pic>
+                        <pic:nvPicPr>
+                          <pic:cNvPr id="0" name="dashboard_live_monitor_RCA_part3.png"/>
+                          <pic:cNvPicPr/>
+                        </pic:nvPicPr>
+                        <pic:blipFill>
+                          <a:blip r:embed="rId30"/>
+                          <a:stretch>
+                            <a:fillRect/>
+                          </a:stretch>
+                        </pic:blipFill>
+                        <pic:spPr>
+                          <a:xfrm>
+                            <a:off x="0" y="0"/>
+                            <a:ext cx="5303520" cy="4209926"/>
+                          </a:xfrm>
+                          <a:prstGeom prst="rect"/>
+                        </pic:spPr>
+                      </pic:pic>
+                    </a:graphicData>
+                  </a:graphic>
+                </wp:inline>
+              </w:drawing>
             </w:r>
           </w:p>
         </w:tc>
@@ -2343,13 +2367,6 @@
         <w:rPr/>
       </w:pPr>
       <w:r>
-        <w:rPr>
-          <w:rFonts w:eastAsia="Times New Roman" w:cs="Times New Roman"/>
-          <w:b w:val="false"/>
-          <w:bCs w:val="false"/>
-          <w:sz w:val="22"/>
-          <w:szCs w:val="22"/>
-        </w:rPr>
         <w:t>Declaration</w:t>
         <w:tab/>
         <w:t>i</w:t>
@@ -2367,13 +2384,6 @@
         <w:rPr/>
       </w:pPr>
       <w:r>
-        <w:rPr>
-          <w:rFonts w:eastAsia="Times New Roman" w:cs="Times New Roman"/>
-          <w:b w:val="false"/>
-          <w:bCs w:val="false"/>
-          <w:sz w:val="22"/>
-          <w:szCs w:val="22"/>
-        </w:rPr>
         <w:t>Certificate</w:t>
         <w:tab/>
         <w:t>ii</w:t>
@@ -2391,13 +2401,6 @@
         <w:rPr/>
       </w:pPr>
       <w:r>
-        <w:rPr>
-          <w:rFonts w:eastAsia="Times New Roman" w:cs="Times New Roman"/>
-          <w:b w:val="false"/>
-          <w:bCs w:val="false"/>
-          <w:sz w:val="22"/>
-          <w:szCs w:val="22"/>
-        </w:rPr>
         <w:t>Abstract</w:t>
         <w:tab/>
         <w:t>iii</w:t>
@@ -2415,13 +2418,6 @@
         <w:rPr/>
       </w:pPr>
       <w:r>
-        <w:rPr>
-          <w:rFonts w:eastAsia="Times New Roman" w:cs="Times New Roman"/>
-          <w:b w:val="false"/>
-          <w:bCs w:val="false"/>
-          <w:sz w:val="22"/>
-          <w:szCs w:val="22"/>
-        </w:rPr>
         <w:t>Acknowledgements</w:t>
         <w:tab/>
         <w:t>iv</w:t>
@@ -2439,13 +2435,6 @@
         <w:rPr/>
       </w:pPr>
       <w:r>
-        <w:rPr>
-          <w:rFonts w:eastAsia="Times New Roman" w:cs="Times New Roman"/>
-          <w:b w:val="false"/>
-          <w:bCs w:val="false"/>
-          <w:sz w:val="22"/>
-          <w:szCs w:val="22"/>
-        </w:rPr>
         <w:t>Codes and Standards</w:t>
         <w:tab/>
         <w:t>v</w:t>
@@ -2463,13 +2452,6 @@
         <w:rPr/>
       </w:pPr>
       <w:r>
-        <w:rPr>
-          <w:rFonts w:eastAsia="Times New Roman" w:cs="Times New Roman"/>
-          <w:b w:val="false"/>
-          <w:bCs w:val="false"/>
-          <w:sz w:val="22"/>
-          <w:szCs w:val="22"/>
-        </w:rPr>
         <w:t>Mapping of Sustainable Development Goals (SDGs)</w:t>
         <w:tab/>
         <w:t>vi</w:t>
@@ -2487,13 +2469,6 @@
         <w:rPr/>
       </w:pPr>
       <w:r>
-        <w:rPr>
-          <w:rFonts w:eastAsia="Times New Roman" w:cs="Times New Roman"/>
-          <w:b w:val="false"/>
-          <w:bCs w:val="false"/>
-          <w:sz w:val="22"/>
-          <w:szCs w:val="22"/>
-        </w:rPr>
         <w:t>List of Figures</w:t>
         <w:tab/>
         <w:t>ix</w:t>
@@ -2511,13 +2486,6 @@
         <w:rPr/>
       </w:pPr>
       <w:r>
-        <w:rPr>
-          <w:rFonts w:eastAsia="Times New Roman" w:cs="Times New Roman"/>
-          <w:b w:val="false"/>
-          <w:bCs w:val="false"/>
-          <w:sz w:val="22"/>
-          <w:szCs w:val="22"/>
-        </w:rPr>
         <w:t>List of Tables</w:t>
         <w:tab/>
         <w:t>x</w:t>
@@ -2535,13 +2503,6 @@
         <w:rPr/>
       </w:pPr>
       <w:r>
-        <w:rPr>
-          <w:rFonts w:eastAsia="Times New Roman" w:cs="Times New Roman"/>
-          <w:b w:val="false"/>
-          <w:bCs w:val="false"/>
-          <w:sz w:val="22"/>
-          <w:szCs w:val="22"/>
-        </w:rPr>
         <w:t>List of Listings</w:t>
         <w:tab/>
         <w:t>xi</w:t>
@@ -2559,13 +2520,6 @@
         <w:rPr/>
       </w:pPr>
       <w:r>
-        <w:rPr>
-          <w:rFonts w:eastAsia="Times New Roman" w:cs="Times New Roman"/>
-          <w:b w:val="false"/>
-          <w:bCs w:val="false"/>
-          <w:sz w:val="22"/>
-          <w:szCs w:val="22"/>
-        </w:rPr>
         <w:t>List of Acronyms</w:t>
         <w:tab/>
         <w:t>xii</w:t>
@@ -2583,14 +2537,7 @@
         <w:rPr/>
       </w:pPr>
       <w:r>
-        <w:rPr>
-          <w:rFonts w:eastAsia="Times New Roman" w:cs="Times New Roman"/>
-          <w:b/>
-          <w:bCs/>
-          <w:sz w:val="22"/>
-          <w:szCs w:val="22"/>
-        </w:rPr>
-        <w:t>1 Introduction</w:t>
+        <w:t>1  Introduction</w:t>
         <w:tab/>
         <w:t>1</w:t>
       </w:r>
@@ -2607,12 +2554,7 @@
         <w:rPr/>
       </w:pPr>
       <w:r>
-        <w:rPr>
-          <w:rFonts w:eastAsia="Times New Roman" w:cs="Times New Roman"/>
-          <w:sz w:val="22"/>
-          <w:szCs w:val="22"/>
-        </w:rPr>
-        <w:t>1.1 Background</w:t>
+        <w:t>1.1  Background</w:t>
         <w:tab/>
         <w:t>1</w:t>
       </w:r>
@@ -2629,12 +2571,7 @@
         <w:rPr/>
       </w:pPr>
       <w:r>
-        <w:rPr>
-          <w:rFonts w:eastAsia="Times New Roman" w:cs="Times New Roman"/>
-          <w:sz w:val="22"/>
-          <w:szCs w:val="22"/>
-        </w:rPr>
-        <w:t>1.2 Problem Statement</w:t>
+        <w:t>1.2  Problem Statement</w:t>
         <w:tab/>
         <w:t>1</w:t>
       </w:r>
@@ -2651,12 +2588,7 @@
         <w:rPr/>
       </w:pPr>
       <w:r>
-        <w:rPr>
-          <w:rFonts w:eastAsia="Times New Roman" w:cs="Times New Roman"/>
-          <w:sz w:val="22"/>
-          <w:szCs w:val="22"/>
-        </w:rPr>
-        <w:t>1.3 Objectives</w:t>
+        <w:t>1.3  Objectives</w:t>
         <w:tab/>
         <w:t>2</w:t>
       </w:r>
@@ -2673,12 +2605,7 @@
         <w:rPr/>
       </w:pPr>
       <w:r>
-        <w:rPr>
-          <w:rFonts w:eastAsia="Times New Roman" w:cs="Times New Roman"/>
-          <w:sz w:val="22"/>
-          <w:szCs w:val="22"/>
-        </w:rPr>
-        <w:t>1.4 Scope</w:t>
+        <w:t>1.4  Scope</w:t>
         <w:tab/>
         <w:t>2</w:t>
       </w:r>
@@ -2695,12 +2622,7 @@
         <w:rPr/>
       </w:pPr>
       <w:r>
-        <w:rPr>
-          <w:rFonts w:eastAsia="Times New Roman" w:cs="Times New Roman"/>
-          <w:sz w:val="22"/>
-          <w:szCs w:val="22"/>
-        </w:rPr>
-        <w:t>1.5 Organisation of the Report</w:t>
+        <w:t>1.5  Organisation of the Report</w:t>
         <w:tab/>
         <w:t>3</w:t>
       </w:r>
@@ -2717,14 +2639,7 @@
         <w:rPr/>
       </w:pPr>
       <w:r>
-        <w:rPr>
-          <w:rFonts w:eastAsia="Times New Roman" w:cs="Times New Roman"/>
-          <w:b/>
-          <w:bCs/>
-          <w:sz w:val="22"/>
-          <w:szCs w:val="22"/>
-        </w:rPr>
-        <w:t>2 Literature Survey</w:t>
+        <w:t>2  Literature Survey</w:t>
         <w:tab/>
         <w:t>4</w:t>
       </w:r>
@@ -2741,12 +2656,7 @@
         <w:rPr/>
       </w:pPr>
       <w:r>
-        <w:rPr>
-          <w:rFonts w:eastAsia="Times New Roman" w:cs="Times New Roman"/>
-          <w:sz w:val="22"/>
-          <w:szCs w:val="22"/>
-        </w:rPr>
-        <w:t>2.1 Network Anomaly Detection</w:t>
+        <w:t>2.1  Network Anomaly Detection</w:t>
         <w:tab/>
         <w:t>4</w:t>
       </w:r>
@@ -2763,12 +2673,7 @@
         <w:rPr/>
       </w:pPr>
       <w:r>
-        <w:rPr>
-          <w:rFonts w:eastAsia="Times New Roman" w:cs="Times New Roman"/>
-          <w:sz w:val="22"/>
-          <w:szCs w:val="22"/>
-        </w:rPr>
-        <w:t>2.2 Log-Based Anomaly Detection</w:t>
+        <w:t>2.2  Log-Based Anomaly Detection</w:t>
         <w:tab/>
         <w:t>4</w:t>
       </w:r>
@@ -2785,12 +2690,7 @@
         <w:rPr/>
       </w:pPr>
       <w:r>
-        <w:rPr>
-          <w:rFonts w:eastAsia="Times New Roman" w:cs="Times New Roman"/>
-          <w:sz w:val="22"/>
-          <w:szCs w:val="22"/>
-        </w:rPr>
-        <w:t>2.3 Root Cause Analysis in Networks</w:t>
+        <w:t>2.3  Root Cause Analysis in Networks</w:t>
         <w:tab/>
         <w:t>5</w:t>
       </w:r>
@@ -2807,12 +2707,7 @@
         <w:rPr/>
       </w:pPr>
       <w:r>
-        <w:rPr>
-          <w:rFonts w:eastAsia="Times New Roman" w:cs="Times New Roman"/>
-          <w:sz w:val="22"/>
-          <w:szCs w:val="22"/>
-        </w:rPr>
-        <w:t>2.4 LLM Agents for Operations</w:t>
+        <w:t>2.4  LLM Agents for Operations</w:t>
         <w:tab/>
         <w:t>5</w:t>
       </w:r>
@@ -2829,12 +2724,7 @@
         <w:rPr/>
       </w:pPr>
       <w:r>
-        <w:rPr>
-          <w:rFonts w:eastAsia="Times New Roman" w:cs="Times New Roman"/>
-          <w:sz w:val="22"/>
-          <w:szCs w:val="22"/>
-        </w:rPr>
-        <w:t>2.5 Emulation and Domain Adaptation</w:t>
+        <w:t>2.5  Emulation and Domain Adaptation</w:t>
         <w:tab/>
         <w:t>5</w:t>
       </w:r>
@@ -2851,12 +2741,7 @@
         <w:rPr/>
       </w:pPr>
       <w:r>
-        <w:rPr>
-          <w:rFonts w:eastAsia="Times New Roman" w:cs="Times New Roman"/>
-          <w:sz w:val="22"/>
-          <w:szCs w:val="22"/>
-        </w:rPr>
-        <w:t>2.6 Summary of the Studies Reviewed</w:t>
+        <w:t>2.6  Summary of the Studies Reviewed</w:t>
         <w:tab/>
         <w:t>6</w:t>
       </w:r>
@@ -2873,14 +2758,9 @@
         <w:rPr/>
       </w:pPr>
       <w:r>
-        <w:rPr>
-          <w:rFonts w:eastAsia="Times New Roman" w:cs="Times New Roman"/>
-          <w:sz w:val="22"/>
-          <w:szCs w:val="22"/>
-        </w:rPr>
-        <w:t>2.7 Gaps Identified</w:t>
+        <w:t>2.7  Gaps Identified</w:t>
         <w:tab/>
-        <w:t>6</w:t>
+        <w:t>7</w:t>
       </w:r>
     </w:p>
     <w:p>
@@ -2895,14 +2775,7 @@
         <w:rPr/>
       </w:pPr>
       <w:r>
-        <w:rPr>
-          <w:rFonts w:eastAsia="Times New Roman" w:cs="Times New Roman"/>
-          <w:b/>
-          <w:bCs/>
-          <w:sz w:val="22"/>
-          <w:szCs w:val="22"/>
-        </w:rPr>
-        <w:t>3 Methodology</w:t>
+        <w:t>3  Methodology</w:t>
         <w:tab/>
         <w:t>8</w:t>
       </w:r>
@@ -2919,12 +2792,7 @@
         <w:rPr/>
       </w:pPr>
       <w:r>
-        <w:rPr>
-          <w:rFonts w:eastAsia="Times New Roman" w:cs="Times New Roman"/>
-          <w:sz w:val="22"/>
-          <w:szCs w:val="22"/>
-        </w:rPr>
-        <w:t>3.1 System Overview</w:t>
+        <w:t>3.1  System Overview</w:t>
         <w:tab/>
         <w:t>8</w:t>
       </w:r>
@@ -2941,12 +2809,7 @@
         <w:rPr/>
       </w:pPr>
       <w:r>
-        <w:rPr>
-          <w:rFonts w:eastAsia="Times New Roman" w:cs="Times New Roman"/>
-          <w:sz w:val="22"/>
-          <w:szCs w:val="22"/>
-        </w:rPr>
-        <w:t>3.2 Data Sources</w:t>
+        <w:t>3.2  Data Sources</w:t>
         <w:tab/>
         <w:t>9</w:t>
       </w:r>
@@ -2963,12 +2826,7 @@
         <w:rPr/>
       </w:pPr>
       <w:r>
-        <w:rPr>
-          <w:rFonts w:eastAsia="Times New Roman" w:cs="Times New Roman"/>
-          <w:sz w:val="21"/>
-          <w:szCs w:val="21"/>
-        </w:rPr>
-        <w:t>3.2.1 Python WAN simulator (training data)</w:t>
+        <w:t>3.2.1  Python WAN simulator (training data)</w:t>
         <w:tab/>
         <w:t>9</w:t>
       </w:r>
@@ -2985,12 +2843,7 @@
         <w:rPr/>
       </w:pPr>
       <w:r>
-        <w:rPr>
-          <w:rFonts w:eastAsia="Times New Roman" w:cs="Times New Roman"/>
-          <w:sz w:val="21"/>
-          <w:szCs w:val="21"/>
-        </w:rPr>
-        <w:t>3.2.2 Mininet emulation (adaptation and validation data)</w:t>
+        <w:t>3.2.2  Mininet emulation (adaptation and validation data)</w:t>
         <w:tab/>
         <w:t>10</w:t>
       </w:r>
@@ -3007,14 +2860,9 @@
         <w:rPr/>
       </w:pPr>
       <w:r>
-        <w:rPr>
-          <w:rFonts w:eastAsia="Times New Roman" w:cs="Times New Roman"/>
-          <w:sz w:val="22"/>
-          <w:szCs w:val="22"/>
-        </w:rPr>
-        <w:t>3.3 Feature Engineering</w:t>
+        <w:t>3.3  Feature Engineering</w:t>
         <w:tab/>
-        <w:t>11</w:t>
+        <w:t>13</w:t>
       </w:r>
     </w:p>
     <w:p>
@@ -3029,14 +2877,9 @@
         <w:rPr/>
       </w:pPr>
       <w:r>
-        <w:rPr>
-          <w:rFonts w:eastAsia="Times New Roman" w:cs="Times New Roman"/>
-          <w:sz w:val="22"/>
-          <w:szCs w:val="22"/>
-        </w:rPr>
-        <w:t>3.4 Tier 1: Random Forest Classifier</w:t>
+        <w:t>3.4  Tier 1: Random Forest Classifier</w:t>
         <w:tab/>
-        <w:t>11</w:t>
+        <w:t>15</w:t>
       </w:r>
     </w:p>
     <w:p>
@@ -3051,14 +2894,9 @@
         <w:rPr/>
       </w:pPr>
       <w:r>
-        <w:rPr>
-          <w:rFonts w:eastAsia="Times New Roman" w:cs="Times New Roman"/>
-          <w:sz w:val="22"/>
-          <w:szCs w:val="22"/>
-        </w:rPr>
-        <w:t>3.5 Tier 2: LSTM Autoencoder with Temporal Attention</w:t>
+        <w:t>3.5  Tier 2: LSTM Autoencoder with Temporal Attention</w:t>
         <w:tab/>
-        <w:t>12</w:t>
+        <w:t>16</w:t>
       </w:r>
     </w:p>
     <w:p>
@@ -3073,14 +2911,9 @@
         <w:rPr/>
       </w:pPr>
       <w:r>
-        <w:rPr>
-          <w:rFonts w:eastAsia="Times New Roman" w:cs="Times New Roman"/>
-          <w:sz w:val="22"/>
-          <w:szCs w:val="22"/>
-        </w:rPr>
-        <w:t>3.6 Cascade Decision Logic</w:t>
+        <w:t>3.6  Cascade Decision Logic</w:t>
         <w:tab/>
-        <w:t>13</w:t>
+        <w:t>17</w:t>
       </w:r>
     </w:p>
     <w:p>
@@ -3095,14 +2928,9 @@
         <w:rPr/>
       </w:pPr>
       <w:r>
-        <w:rPr>
-          <w:rFonts w:eastAsia="Times New Roman" w:cs="Times New Roman"/>
-          <w:sz w:val="22"/>
-          <w:szCs w:val="22"/>
-        </w:rPr>
-        <w:t>3.7 Domain Adaptation to Mininet Data</w:t>
+        <w:t>3.7  Domain Adaptation to Mininet Data</w:t>
         <w:tab/>
-        <w:t>13</w:t>
+        <w:t>17</w:t>
       </w:r>
     </w:p>
     <w:p>
@@ -3117,14 +2945,9 @@
         <w:rPr/>
       </w:pPr>
       <w:r>
-        <w:rPr>
-          <w:rFonts w:eastAsia="Times New Roman" w:cs="Times New Roman"/>
-          <w:sz w:val="22"/>
-          <w:szCs w:val="22"/>
-        </w:rPr>
-        <w:t>3.8 Tier 3: LangGraph ReAct Agent</w:t>
+        <w:t>3.8  Tier 3: LangGraph ReAct Agent</w:t>
         <w:tab/>
-        <w:t>14</w:t>
+        <w:t>18</w:t>
       </w:r>
     </w:p>
     <w:p>
@@ -3139,14 +2962,9 @@
         <w:rPr/>
       </w:pPr>
       <w:r>
-        <w:rPr>
-          <w:rFonts w:eastAsia="Times New Roman" w:cs="Times New Roman"/>
-          <w:sz w:val="22"/>
-          <w:szCs w:val="22"/>
-        </w:rPr>
-        <w:t>3.9 Live Pipeline and Dashboard</w:t>
+        <w:t>3.9  Live Pipeline and Dashboard</w:t>
         <w:tab/>
-        <w:t>15</w:t>
+        <w:t>19</w:t>
       </w:r>
     </w:p>
     <w:p>
@@ -3161,14 +2979,9 @@
         <w:rPr/>
       </w:pPr>
       <w:r>
-        <w:rPr>
-          <w:rFonts w:eastAsia="Times New Roman" w:cs="Times New Roman"/>
-          <w:sz w:val="22"/>
-          <w:szCs w:val="22"/>
-        </w:rPr>
-        <w:t>3.10 Implementation Environment</w:t>
+        <w:t>3.10  Implementation Environment</w:t>
         <w:tab/>
-        <w:t>16</w:t>
+        <w:t>20</w:t>
       </w:r>
     </w:p>
     <w:p>
@@ -3183,14 +2996,9 @@
         <w:rPr/>
       </w:pPr>
       <w:r>
-        <w:rPr>
-          <w:rFonts w:eastAsia="Times New Roman" w:cs="Times New Roman"/>
-          <w:sz w:val="22"/>
-          <w:szCs w:val="22"/>
-        </w:rPr>
-        <w:t>3.11 Evaluation Metrics</w:t>
+        <w:t>3.11  Evaluation Metrics</w:t>
         <w:tab/>
-        <w:t>17</w:t>
+        <w:t>20</w:t>
       </w:r>
     </w:p>
     <w:p>
@@ -3205,16 +3013,9 @@
         <w:rPr/>
       </w:pPr>
       <w:r>
-        <w:rPr>
-          <w:rFonts w:eastAsia="Times New Roman" w:cs="Times New Roman"/>
-          <w:b/>
-          <w:bCs/>
-          <w:sz w:val="22"/>
-          <w:szCs w:val="22"/>
-        </w:rPr>
-        <w:t>4 Results and Discussion</w:t>
+        <w:t>4  Results and Discussion</w:t>
         <w:tab/>
-        <w:t>18</w:t>
+        <w:t>21</w:t>
       </w:r>
     </w:p>
     <w:p>
@@ -3229,14 +3030,9 @@
         <w:rPr/>
       </w:pPr>
       <w:r>
-        <w:rPr>
-          <w:rFonts w:eastAsia="Times New Roman" w:cs="Times New Roman"/>
-          <w:sz w:val="22"/>
-          <w:szCs w:val="22"/>
-        </w:rPr>
-        <w:t>4.1 Experimental Setup</w:t>
+        <w:t>4.1  Experimental Setup</w:t>
         <w:tab/>
-        <w:t>18</w:t>
+        <w:t>21</w:t>
       </w:r>
     </w:p>
     <w:p>
@@ -3251,14 +3047,9 @@
         <w:rPr/>
       </w:pPr>
       <w:r>
-        <w:rPr>
-          <w:rFonts w:eastAsia="Times New Roman" w:cs="Times New Roman"/>
-          <w:sz w:val="22"/>
-          <w:szCs w:val="22"/>
-        </w:rPr>
-        <w:t>4.2 Detection Results on Simulated Data</w:t>
+        <w:t>4.2  Detection Results on Simulated Data</w:t>
         <w:tab/>
-        <w:t>18</w:t>
+        <w:t>21</w:t>
       </w:r>
     </w:p>
     <w:p>
@@ -3273,14 +3064,9 @@
         <w:rPr/>
       </w:pPr>
       <w:r>
-        <w:rPr>
-          <w:rFonts w:eastAsia="Times New Roman" w:cs="Times New Roman"/>
-          <w:sz w:val="22"/>
-          <w:szCs w:val="22"/>
-        </w:rPr>
-        <w:t>4.3 Improvement of the LSTM Autoencoder</w:t>
+        <w:t>4.3  Improvement of the LSTM Autoencoder</w:t>
         <w:tab/>
-        <w:t>20</w:t>
+        <w:t>23</w:t>
       </w:r>
     </w:p>
     <w:p>
@@ -3295,14 +3081,9 @@
         <w:rPr/>
       </w:pPr>
       <w:r>
-        <w:rPr>
-          <w:rFonts w:eastAsia="Times New Roman" w:cs="Times New Roman"/>
-          <w:sz w:val="22"/>
-          <w:szCs w:val="22"/>
-        </w:rPr>
-        <w:t>4.4 False-Positive Suppression by the Cascade</w:t>
+        <w:t>4.4  False-Positive Suppression by the Cascade</w:t>
         <w:tab/>
-        <w:t>20</w:t>
+        <w:t>25</w:t>
       </w:r>
     </w:p>
     <w:p>
@@ -3317,14 +3098,9 @@
         <w:rPr/>
       </w:pPr>
       <w:r>
-        <w:rPr>
-          <w:rFonts w:eastAsia="Times New Roman" w:cs="Times New Roman"/>
-          <w:sz w:val="22"/>
-          <w:szCs w:val="22"/>
-        </w:rPr>
-        <w:t>4.5 Evaluation on Mininet Data</w:t>
+        <w:t>4.5  Evaluation on Mininet Data</w:t>
         <w:tab/>
-        <w:t>21</w:t>
+        <w:t>26</w:t>
       </w:r>
     </w:p>
     <w:p>
@@ -3339,14 +3115,9 @@
         <w:rPr/>
       </w:pPr>
       <w:r>
-        <w:rPr>
-          <w:rFonts w:eastAsia="Times New Roman" w:cs="Times New Roman"/>
-          <w:sz w:val="22"/>
-          <w:szCs w:val="22"/>
-        </w:rPr>
-        <w:t>4.6 Evaluation of the ReAct Agent</w:t>
+        <w:t>4.6  Evaluation of the ReAct Agent</w:t>
         <w:tab/>
-        <w:t>22</w:t>
+        <w:t>27</w:t>
       </w:r>
     </w:p>
     <w:p>
@@ -3361,14 +3132,9 @@
         <w:rPr/>
       </w:pPr>
       <w:r>
-        <w:rPr>
-          <w:rFonts w:eastAsia="Times New Roman" w:cs="Times New Roman"/>
-          <w:sz w:val="21"/>
-          <w:szCs w:val="21"/>
-        </w:rPr>
-        <w:t>4.6.1 Example of the ReAct loop</w:t>
+        <w:t>4.6.1  Example of the ReAct loop</w:t>
         <w:tab/>
-        <w:t>22</w:t>
+        <w:t>27</w:t>
       </w:r>
     </w:p>
     <w:p>
@@ -3383,14 +3149,9 @@
         <w:rPr/>
       </w:pPr>
       <w:r>
-        <w:rPr>
-          <w:rFonts w:eastAsia="Times New Roman" w:cs="Times New Roman"/>
-          <w:sz w:val="21"/>
-          <w:szCs w:val="21"/>
-        </w:rPr>
-        <w:t>4.6.2 RCA accuracy and response time</w:t>
+        <w:t>4.6.2  RCA accuracy and response time</w:t>
         <w:tab/>
-        <w:t>23</w:t>
+        <w:t>28</w:t>
       </w:r>
     </w:p>
     <w:p>
@@ -3405,14 +3166,9 @@
         <w:rPr/>
       </w:pPr>
       <w:r>
-        <w:rPr>
-          <w:rFonts w:eastAsia="Times New Roman" w:cs="Times New Roman"/>
-          <w:sz w:val="22"/>
-          <w:szCs w:val="22"/>
-        </w:rPr>
-        <w:t>4.7 Complex Scenarios</w:t>
+        <w:t>4.7  Complex Scenarios</w:t>
         <w:tab/>
-        <w:t>23</w:t>
+        <w:t>29</w:t>
       </w:r>
     </w:p>
     <w:p>
@@ -3427,14 +3183,9 @@
         <w:rPr/>
       </w:pPr>
       <w:r>
-        <w:rPr>
-          <w:rFonts w:eastAsia="Times New Roman" w:cs="Times New Roman"/>
-          <w:sz w:val="22"/>
-          <w:szCs w:val="22"/>
-        </w:rPr>
-        <w:t>4.8 Dashboard Demonstration</w:t>
+        <w:t>4.8  Dashboard Demonstration</w:t>
         <w:tab/>
-        <w:t>24</w:t>
+        <w:t>29</w:t>
       </w:r>
     </w:p>
     <w:p>
@@ -3449,14 +3200,9 @@
         <w:rPr/>
       </w:pPr>
       <w:r>
-        <w:rPr>
-          <w:rFonts w:eastAsia="Times New Roman" w:cs="Times New Roman"/>
-          <w:sz w:val="22"/>
-          <w:szCs w:val="22"/>
-        </w:rPr>
-        <w:t>4.9 Summary of Results</w:t>
+        <w:t>4.9  Summary of Results</w:t>
         <w:tab/>
-        <w:t>25</w:t>
+        <w:t>31</w:t>
       </w:r>
     </w:p>
     <w:p>
@@ -3471,14 +3217,9 @@
         <w:rPr/>
       </w:pPr>
       <w:r>
-        <w:rPr>
-          <w:rFonts w:eastAsia="Times New Roman" w:cs="Times New Roman"/>
-          <w:sz w:val="22"/>
-          <w:szCs w:val="22"/>
-        </w:rPr>
-        <w:t>4.10 Discussion</w:t>
+        <w:t>4.10  Discussion</w:t>
         <w:tab/>
-        <w:t>26</w:t>
+        <w:t>32</w:t>
       </w:r>
     </w:p>
     <w:p>
@@ -3493,16 +3234,9 @@
         <w:rPr/>
       </w:pPr>
       <w:r>
-        <w:rPr>
-          <w:rFonts w:eastAsia="Times New Roman" w:cs="Times New Roman"/>
-          <w:b/>
-          <w:bCs/>
-          <w:sz w:val="22"/>
-          <w:szCs w:val="22"/>
-        </w:rPr>
-        <w:t>5 Conclusion and Future Work</w:t>
+        <w:t>5  Conclusion and Future Work</w:t>
         <w:tab/>
-        <w:t>27</w:t>
+        <w:t>34</w:t>
       </w:r>
     </w:p>
     <w:p>
@@ -3517,14 +3251,9 @@
         <w:rPr/>
       </w:pPr>
       <w:r>
-        <w:rPr>
-          <w:rFonts w:eastAsia="Times New Roman" w:cs="Times New Roman"/>
-          <w:sz w:val="22"/>
-          <w:szCs w:val="22"/>
-        </w:rPr>
-        <w:t>5.1 Conclusion</w:t>
+        <w:t>5.1  Conclusion</w:t>
         <w:tab/>
-        <w:t>27</w:t>
+        <w:t>34</w:t>
       </w:r>
     </w:p>
     <w:p>
@@ -3539,14 +3268,9 @@
         <w:rPr/>
       </w:pPr>
       <w:r>
-        <w:rPr>
-          <w:rFonts w:eastAsia="Times New Roman" w:cs="Times New Roman"/>
-          <w:sz w:val="22"/>
-          <w:szCs w:val="22"/>
-        </w:rPr>
-        <w:t>5.2 Limitations</w:t>
+        <w:t>5.2  Limitations</w:t>
         <w:tab/>
-        <w:t>27</w:t>
+        <w:t>34</w:t>
       </w:r>
     </w:p>
     <w:p>
@@ -3561,14 +3285,9 @@
         <w:rPr/>
       </w:pPr>
       <w:r>
-        <w:rPr>
-          <w:rFonts w:eastAsia="Times New Roman" w:cs="Times New Roman"/>
-          <w:sz w:val="22"/>
-          <w:szCs w:val="22"/>
-        </w:rPr>
-        <w:t>5.3 Future Work</w:t>
+        <w:t>5.3  Future Work</w:t>
         <w:tab/>
-        <w:t>28</w:t>
+        <w:t>35</w:t>
       </w:r>
     </w:p>
     <w:p>
@@ -3583,16 +3302,7 @@
         <w:rPr/>
       </w:pPr>
       <w:r>
-        <w:rPr>
-          <w:rFonts w:eastAsia="Times New Roman" w:cs="Times New Roman"/>
-          <w:b/>
-          <w:bCs/>
-          <w:sz w:val="22"/>
-          <w:szCs w:val="22"/>
-        </w:rPr>
-        <w:t>Appendix 1: Code Listings</w:t>
-        <w:tab/>
-        <w:t>29</w:t>
+        <w:t>Appendix 1: Code Listings  36</w:t>
       </w:r>
     </w:p>
     <w:p>
@@ -3607,16 +3317,7 @@
         <w:rPr/>
       </w:pPr>
       <w:r>
-        <w:rPr>
-          <w:rFonts w:eastAsia="Times New Roman" w:cs="Times New Roman"/>
-          <w:b/>
-          <w:bCs/>
-          <w:sz w:val="22"/>
-          <w:szCs w:val="22"/>
-        </w:rPr>
-        <w:t>Appendix 2: Pipeline State and Configuration</w:t>
-        <w:tab/>
-        <w:t>31</w:t>
+        <w:t>Appendix 2: Pipeline State and Configuration  38</w:t>
       </w:r>
     </w:p>
     <w:p>
@@ -3631,16 +3332,7 @@
         <w:rPr/>
       </w:pPr>
       <w:r>
-        <w:rPr>
-          <w:rFonts w:eastAsia="Times New Roman" w:cs="Times New Roman"/>
-          <w:b/>
-          <w:bCs/>
-          <w:sz w:val="22"/>
-          <w:szCs w:val="22"/>
-        </w:rPr>
-        <w:t>Bibliography</w:t>
-        <w:tab/>
-        <w:t>32</w:t>
+        <w:t>Appendix 3: Dashboard and Evaluation Evidence  39</w:t>
       </w:r>
     </w:p>
     <w:p>
@@ -3655,19 +3347,7 @@
         <w:rPr/>
       </w:pPr>
       <w:r>
-        <w:rPr>
-          <w:rFonts w:eastAsia="Times New Roman" w:cs="Times New Roman"/>
-          <w:b/>
-          <w:bCs/>
-          <w:sz w:val="22"/>
-          <w:szCs w:val="22"/>
-        </w:rPr>
-        <w:t>Biodata</w:t>
-        <w:tab/>
-        <w:t>35</w:t>
-      </w:r>
-      <w:r>
-        <w:br w:type="page"/>
+        <w:t>Bibliography  47</w:t>
       </w:r>
     </w:p>
     <w:p>
@@ -3700,11 +3380,6 @@
         <w:rPr/>
       </w:pPr>
       <w:r>
-        <w:rPr>
-          <w:rFonts w:eastAsia="Times New Roman" w:cs="Times New Roman"/>
-          <w:sz w:val="22"/>
-          <w:szCs w:val="22"/>
-        </w:rPr>
         <w:t>Figure 3.1: System architecture: detection (Tiers 1 and 2) gating investigation (Tier 3)</w:t>
         <w:tab/>
         <w:t>8</w:t>
@@ -3722,14 +3397,9 @@
         <w:rPr/>
       </w:pPr>
       <w:r>
-        <w:rPr>
-          <w:rFonts w:eastAsia="Times New Roman" w:cs="Times New Roman"/>
-          <w:sz w:val="22"/>
-          <w:szCs w:val="22"/>
-        </w:rPr>
-        <w:t>Figure 3.2: Mininet spine-leaf topology and telemetry collection</w:t>
+        <w:t>Figure 3.2: Mininet Real-Data Lab dashboard showing augmented-dataset overview</w:t>
         <w:tab/>
-        <w:t>11</w:t>
+        <w:t>13</w:t>
       </w:r>
     </w:p>
     <w:p>
@@ -3744,14 +3414,9 @@
         <w:rPr/>
       </w:pPr>
       <w:r>
-        <w:rPr>
-          <w:rFonts w:eastAsia="Times New Roman" w:cs="Times New Roman"/>
-          <w:sz w:val="22"/>
-          <w:szCs w:val="22"/>
-        </w:rPr>
-        <w:t>Figure 3.3: Live pipeline state machine (idle, fault cycle, recover)</w:t>
+        <w:t>Figure 3.3: Live Monitor dashboard in replay-mode idle state</w:t>
         <w:tab/>
-        <w:t>16</w:t>
+        <w:t>19</w:t>
       </w:r>
     </w:p>
     <w:p>
@@ -3766,14 +3431,9 @@
         <w:rPr/>
       </w:pPr>
       <w:r>
-        <w:rPr>
-          <w:rFonts w:eastAsia="Times New Roman" w:cs="Times New Roman"/>
-          <w:sz w:val="22"/>
-          <w:szCs w:val="22"/>
-        </w:rPr>
-        <w:t>Figure 4.1: Evaluation output for both detectors on the simulated test set</w:t>
+        <w:t>Figure 4.1: Simulated-data detector evaluation output</w:t>
         <w:tab/>
-        <w:t>19</w:t>
+        <w:t>22</w:t>
       </w:r>
     </w:p>
     <w:p>
@@ -3788,14 +3448,9 @@
         <w:rPr/>
       </w:pPr>
       <w:r>
-        <w:rPr>
-          <w:rFonts w:eastAsia="Times New Roman" w:cs="Times New Roman"/>
-          <w:sz w:val="22"/>
-          <w:szCs w:val="22"/>
-        </w:rPr>
-        <w:t>Figure 4.2: Confusion matrices of the Random Forest and the LSTM autoencoder</w:t>
+        <w:t>Figure 4.2: Dashboard confusion-matrix view for detector evaluation</w:t>
         <w:tab/>
-        <w:t>19</w:t>
+        <w:t>22</w:t>
       </w:r>
     </w:p>
     <w:p>
@@ -3810,14 +3465,9 @@
         <w:rPr/>
       </w:pPr>
       <w:r>
-        <w:rPr>
-          <w:rFonts w:eastAsia="Times New Roman" w:cs="Times New Roman"/>
-          <w:sz w:val="22"/>
-          <w:szCs w:val="22"/>
-        </w:rPr>
-        <w:t>Figure 4.3: ROC and precision-recall curves of the two detectors</w:t>
+        <w:t>Figure 4.3: Dashboard receiver-operating-characteristic curves</w:t>
         <w:tab/>
-        <w:t>19</w:t>
+        <w:t>23</w:t>
       </w:r>
     </w:p>
     <w:p>
@@ -3832,14 +3482,9 @@
         <w:rPr/>
       </w:pPr>
       <w:r>
-        <w:rPr>
-          <w:rFonts w:eastAsia="Times New Roman" w:cs="Times New Roman"/>
-          <w:sz w:val="22"/>
-          <w:szCs w:val="22"/>
-        </w:rPr>
-        <w:t>Figure 4.4: Training and validation loss of the LSTM autoencoder, and distribution of reconstruction errors with the threshold</w:t>
+        <w:t>Figure 4.4: Reconstruction-error distribution from diagnostic evaluation</w:t>
         <w:tab/>
-        <w:t>20</w:t>
+        <w:t>24</w:t>
       </w:r>
     </w:p>
     <w:p>
@@ -3854,14 +3499,9 @@
         <w:rPr/>
       </w:pPr>
       <w:r>
-        <w:rPr>
-          <w:rFonts w:eastAsia="Times New Roman" w:cs="Times New Roman"/>
-          <w:sz w:val="22"/>
-          <w:szCs w:val="22"/>
-        </w:rPr>
-        <w:t>Figure 4.5: Metrics before and after domain adaptation</w:t>
+        <w:t>Figure 4.5: Mininet Lab view of per-fault performance and probe-signal distributions</w:t>
         <w:tab/>
-        <w:t>22</w:t>
+        <w:t>26</w:t>
       </w:r>
     </w:p>
     <w:p>
@@ -3876,14 +3516,9 @@
         <w:rPr/>
       </w:pPr>
       <w:r>
-        <w:rPr>
-          <w:rFonts w:eastAsia="Times New Roman" w:cs="Times New Roman"/>
-          <w:sz w:val="22"/>
-          <w:szCs w:val="22"/>
-        </w:rPr>
-        <w:t>Figure 4.6: Agent investigation steps and incident report produced for an injected fault</w:t>
+        <w:t>Figure 4.6: Root-cause analysis incident summary in the dashboard</w:t>
         <w:tab/>
-        <w:t>23</w:t>
+        <w:t>27</w:t>
       </w:r>
     </w:p>
     <w:p>
@@ -3898,7 +3533,9 @@
         <w:rPr/>
       </w:pPr>
       <w:r>
-        <w:t>Figure 4.7: Dashboard Live Monitor in idle state</w:t>
+        <w:t>Figure 4.7: Dashboard Live Monitor before a replay fault request</w:t>
+        <w:tab/>
+        <w:t>29</w:t>
       </w:r>
     </w:p>
     <w:p>
@@ -3913,7 +3550,9 @@
         <w:rPr/>
       </w:pPr>
       <w:r>
-        <w:t>Figure 4.8: Dashboard Tier 1 known-fault verdict</w:t>
+        <w:t>Figure 4.8: Dashboard after a replay fault request and detector evaluation</w:t>
+        <w:tab/>
+        <w:t>29</w:t>
       </w:r>
     </w:p>
     <w:p>
@@ -3928,7 +3567,9 @@
         <w:rPr/>
       </w:pPr>
       <w:r>
-        <w:t>Figure 4.9: Dashboard Tier 2 score and agent tool trajectory</w:t>
+        <w:t>Figure 4.9: Dashboard root-cause evidence chain</w:t>
+        <w:tab/>
+        <w:t>30</w:t>
       </w:r>
     </w:p>
     <w:p>
@@ -3943,7 +3584,149 @@
         <w:rPr/>
       </w:pPr>
       <w:r>
-        <w:t>Figure 4.10: Dashboard final RCA report and remediation</w:t>
+        <w:t>Figure 4.10: Dashboard root-cause classification and remediation view</w:t>
+        <w:tab/>
+        <w:t>31</w:t>
+      </w:r>
+    </w:p>
+    <w:p>
+      <w:pPr>
+        <w:pStyle w:val="Normal"/>
+        <w:spacing w:after="80" w:before="0"/>
+        <w:ind w:hanging="1500" w:left="1440"/>
+      </w:pPr>
+      <w:r>
+        <w:t>Figure A3.1: Root-cause evidence chain continuation...........................................39</w:t>
+      </w:r>
+    </w:p>
+    <w:p>
+      <w:pPr>
+        <w:pStyle w:val="Normal"/>
+        <w:spacing w:after="80" w:before="0"/>
+        <w:ind w:hanging="1500" w:left="1440"/>
+      </w:pPr>
+      <w:r>
+        <w:t>Figure A3.2: Root-cause remediation recommendations...........................................39</w:t>
+      </w:r>
+    </w:p>
+    <w:p>
+      <w:pPr>
+        <w:pStyle w:val="Normal"/>
+        <w:spacing w:after="80" w:before="0"/>
+        <w:ind w:hanging="1500" w:left="1440"/>
+      </w:pPr>
+      <w:r>
+        <w:t>Figure A3.3: Root-cause long-term remediation recommendations.................................40</w:t>
+      </w:r>
+    </w:p>
+    <w:p>
+      <w:pPr>
+        <w:pStyle w:val="Normal"/>
+        <w:spacing w:after="80" w:before="0"/>
+        <w:ind w:hanging="1500" w:left="1440"/>
+      </w:pPr>
+      <w:r>
+        <w:t>Figure A3.4: Root-cause confidence assessment.................................................41</w:t>
+      </w:r>
+    </w:p>
+    <w:p>
+      <w:pPr>
+        <w:pStyle w:val="Normal"/>
+        <w:spacing w:after="80" w:before="0"/>
+        <w:ind w:hanging="1500" w:left="1440"/>
+      </w:pPr>
+      <w:r>
+        <w:t>Figure A3.5: Root-cause tool-evidence analysis panel..........................................42</w:t>
+      </w:r>
+    </w:p>
+    <w:p>
+      <w:pPr>
+        <w:pStyle w:val="Normal"/>
+        <w:spacing w:after="80" w:before="0"/>
+        <w:ind w:hanging="1500" w:left="1440"/>
+      </w:pPr>
+      <w:r>
+        <w:t>Figure A3.6: Root-cause discarded-hypotheses panel............................................43</w:t>
+      </w:r>
+    </w:p>
+    <w:p>
+      <w:pPr>
+        <w:pStyle w:val="Normal"/>
+        <w:spacing w:after="80" w:before="0"/>
+        <w:ind w:hanging="1500" w:left="1440"/>
+      </w:pPr>
+      <w:r>
+        <w:t>Figure A3.7: Telemetry Analytics dashboard overview...........................................43</w:t>
+      </w:r>
+    </w:p>
+    <w:p>
+      <w:pPr>
+        <w:pStyle w:val="Normal"/>
+        <w:spacing w:after="80" w:before="0"/>
+        <w:ind w:hanging="1500" w:left="1440"/>
+      </w:pPr>
+      <w:r>
+        <w:t>Figure A3.8: Telemetry Analytics fault-distribution and metric panels.........................44</w:t>
+      </w:r>
+    </w:p>
+    <w:p>
+      <w:pPr>
+        <w:pStyle w:val="Normal"/>
+        <w:spacing w:after="80" w:before="0"/>
+        <w:ind w:hanging="1500" w:left="1440"/>
+      </w:pPr>
+      <w:r>
+        <w:t>Figure A3.9: Telemetry Analytics anomaly and feature views....................................44</w:t>
+      </w:r>
+    </w:p>
+    <w:p>
+      <w:pPr>
+        <w:pStyle w:val="Normal"/>
+        <w:spacing w:after="80" w:before="0"/>
+        <w:ind w:hanging="1500" w:left="1440"/>
+      </w:pPr>
+      <w:r>
+        <w:t>Figure A3.10: Benchmark dashboard summary cards...............................................44</w:t>
+      </w:r>
+    </w:p>
+    <w:p>
+      <w:pPr>
+        <w:pStyle w:val="Normal"/>
+        <w:spacing w:after="80" w:before="0"/>
+        <w:ind w:hanging="1500" w:left="1440"/>
+      </w:pPr>
+      <w:r>
+        <w:t>Figure A3.11: Benchmark dashboard detailed scenario table.....................................45</w:t>
+      </w:r>
+    </w:p>
+    <w:p>
+      <w:pPr>
+        <w:pStyle w:val="Normal"/>
+        <w:spacing w:after="80" w:before="0"/>
+        <w:ind w:hanging="1500" w:left="1440"/>
+      </w:pPr>
+      <w:r>
+        <w:t>Figure A3.12: Results-folder confusion matrices...............................................45</w:t>
+      </w:r>
+    </w:p>
+    <w:p>
+      <w:pPr>
+        <w:pStyle w:val="Normal"/>
+        <w:spacing w:after="80" w:before="0"/>
+        <w:ind w:hanging="1500" w:left="1440"/>
+      </w:pPr>
+      <w:r>
+        <w:t>Figure A3.13: Results-folder ROC and precision-recall curves..................................45</w:t>
+      </w:r>
+    </w:p>
+    <w:p>
+      <w:pPr>
+        <w:pStyle w:val="Normal"/>
+        <w:spacing w:after="80" w:before="0"/>
+        <w:ind w:hanging="1500" w:left="1440"/>
+      </w:pPr>
+      <w:r>
+        <w:t>Figure A3.14: Results-folder threshold-sweep diagnostic.......................................46</w:t>
       </w:r>
     </w:p>
     <w:p>
@@ -3976,11 +3759,6 @@
         <w:rPr/>
       </w:pPr>
       <w:r>
-        <w:rPr>
-          <w:rFonts w:eastAsia="Times New Roman" w:cs="Times New Roman"/>
-          <w:sz w:val="22"/>
-          <w:szCs w:val="22"/>
-        </w:rPr>
         <w:t>Table 2.1: Summary of the fifteen studies reviewed</w:t>
         <w:tab/>
         <w:t>6</w:t>
@@ -3998,14 +3776,9 @@
         <w:rPr/>
       </w:pPr>
       <w:r>
-        <w:rPr>
-          <w:rFonts w:eastAsia="Times New Roman" w:cs="Times New Roman"/>
-          <w:sz w:val="22"/>
-          <w:szCs w:val="22"/>
-        </w:rPr>
         <w:t>Table 3.1: Telemetry schema of the simulator</w:t>
         <w:tab/>
-        <w:t>9</w:t>
+        <w:t>10</w:t>
       </w:r>
     </w:p>
     <w:p>
@@ -4020,14 +3793,9 @@
         <w:rPr/>
       </w:pPr>
       <w:r>
-        <w:rPr>
-          <w:rFonts w:eastAsia="Times New Roman" w:cs="Times New Roman"/>
-          <w:sz w:val="22"/>
-          <w:szCs w:val="22"/>
-        </w:rPr>
-        <w:t>Table 3.2: Target fault types and their injection in Mininet</w:t>
+        <w:t>Table 3.1a: Engineered feature interpretation</w:t>
         <w:tab/>
-        <w:t>10</w:t>
+        <w:t>14</w:t>
       </w:r>
     </w:p>
     <w:p>
@@ -4042,14 +3810,9 @@
         <w:rPr/>
       </w:pPr>
       <w:r>
-        <w:rPr>
-          <w:rFonts w:eastAsia="Times New Roman" w:cs="Times New Roman"/>
-          <w:sz w:val="22"/>
-          <w:szCs w:val="22"/>
-        </w:rPr>
-        <w:t>Table 3.3: Decision logic of the three-tier cascade</w:t>
+        <w:t>Table 3.2: Target fault types and their injection in Mininet</w:t>
         <w:tab/>
-        <w:t>13</w:t>
+        <w:t>12</w:t>
       </w:r>
     </w:p>
     <w:p>
@@ -4064,14 +3827,9 @@
         <w:rPr/>
       </w:pPr>
       <w:r>
-        <w:rPr>
-          <w:rFonts w:eastAsia="Times New Roman" w:cs="Times New Roman"/>
-          <w:sz w:val="22"/>
-          <w:szCs w:val="22"/>
-        </w:rPr>
-        <w:t>Table 3.4: Diagnostic tools available to the agent</w:t>
+        <w:t>Table 3.3: Decision logic of the three-tier cascade</w:t>
         <w:tab/>
-        <w:t>14</w:t>
+        <w:t>17</w:t>
       </w:r>
     </w:p>
     <w:p>
@@ -4086,14 +3844,9 @@
         <w:rPr/>
       </w:pPr>
       <w:r>
-        <w:rPr>
-          <w:rFonts w:eastAsia="Times New Roman" w:cs="Times New Roman"/>
-          <w:sz w:val="22"/>
-          <w:szCs w:val="22"/>
-        </w:rPr>
-        <w:t>Table 3.5: Software stack</w:t>
+        <w:t>Table 3.4: Diagnostic tools available to the agent</w:t>
         <w:tab/>
-        <w:t>16</w:t>
+        <w:t>18</w:t>
       </w:r>
     </w:p>
     <w:p>
@@ -4108,14 +3861,9 @@
         <w:rPr/>
       </w:pPr>
       <w:r>
-        <w:rPr>
-          <w:rFonts w:eastAsia="Times New Roman" w:cs="Times New Roman"/>
-          <w:sz w:val="22"/>
-          <w:szCs w:val="22"/>
-        </w:rPr>
-        <w:t>Table 3.6: Summary of the configuration of the three tiers</w:t>
+        <w:t>Table 3.5: Software stack</w:t>
         <w:tab/>
-        <w:t>16</w:t>
+        <w:t>20</w:t>
       </w:r>
     </w:p>
     <w:p>
@@ -4130,14 +3878,9 @@
         <w:rPr/>
       </w:pPr>
       <w:r>
-        <w:rPr>
-          <w:rFonts w:eastAsia="Times New Roman" w:cs="Times New Roman"/>
-          <w:sz w:val="22"/>
-          <w:szCs w:val="22"/>
-        </w:rPr>
-        <w:t>Table 4.1: Datasets used in the experiments</w:t>
+        <w:t>Table 3.6: Summary of the configuration of the three tiers</w:t>
         <w:tab/>
-        <w:t>18</w:t>
+        <w:t>20</w:t>
       </w:r>
     </w:p>
     <w:p>
@@ -4152,14 +3895,9 @@
         <w:rPr/>
       </w:pPr>
       <w:r>
-        <w:rPr>
-          <w:rFonts w:eastAsia="Times New Roman" w:cs="Times New Roman"/>
-          <w:sz w:val="22"/>
-          <w:szCs w:val="22"/>
-        </w:rPr>
-        <w:t>Table 4.2: Test-set metrics on the simulated data (152,064 rows, 164 anomalous rows)</w:t>
+        <w:t>Table 4.1: Datasets used in the experiments</w:t>
         <w:tab/>
-        <w:t>18</w:t>
+        <w:t>21</w:t>
       </w:r>
     </w:p>
     <w:p>
@@ -4174,14 +3912,9 @@
         <w:rPr/>
       </w:pPr>
       <w:r>
-        <w:rPr>
-          <w:rFonts w:eastAsia="Times New Roman" w:cs="Times New Roman"/>
-          <w:sz w:val="22"/>
-          <w:szCs w:val="22"/>
-        </w:rPr>
-        <w:t>Table 4.3: Effect of the refinements on the F1 score of the LSTM autoencoder</w:t>
+        <w:t>Table 4.2: Test-set metrics on the simulated data</w:t>
         <w:tab/>
-        <w:t>20</w:t>
+        <w:t>21</w:t>
       </w:r>
     </w:p>
     <w:p>
@@ -4196,14 +3929,9 @@
         <w:rPr/>
       </w:pPr>
       <w:r>
-        <w:rPr>
-          <w:rFonts w:eastAsia="Times New Roman" w:cs="Times New Roman"/>
-          <w:sz w:val="22"/>
-          <w:szCs w:val="22"/>
-        </w:rPr>
-        <w:t>Table 4.4: Counters of the detection funnel in a test run</w:t>
+        <w:t>Table 4.3: Effect of the refinements on the LSTM autoencoder</w:t>
         <w:tab/>
-        <w:t>21</w:t>
+        <w:t>25</w:t>
       </w:r>
     </w:p>
     <w:p>
@@ -4218,14 +3946,9 @@
         <w:rPr/>
       </w:pPr>
       <w:r>
-        <w:rPr>
-          <w:rFonts w:eastAsia="Times New Roman" w:cs="Times New Roman"/>
-          <w:sz w:val="22"/>
-          <w:szCs w:val="22"/>
-        </w:rPr>
-        <w:t>Table 4.5: Detection metrics on the Mininet test split before and after fine-tuning</w:t>
+        <w:t>Table 4.4: Counters of the detection funnel in a test run</w:t>
         <w:tab/>
-        <w:t>21</w:t>
+        <w:t>25</w:t>
       </w:r>
     </w:p>
     <w:p>
@@ -4240,14 +3963,9 @@
         <w:rPr/>
       </w:pPr>
       <w:r>
-        <w:rPr>
-          <w:rFonts w:eastAsia="Times New Roman" w:cs="Times New Roman"/>
-          <w:sz w:val="22"/>
-          <w:szCs w:val="22"/>
-        </w:rPr>
-        <w:t>Table 4.6: RCA accuracy and response time of the agent per fault type</w:t>
+        <w:t>Table 4.5: Detection metrics on the Mininet test split before and after fine-tuning</w:t>
         <w:tab/>
-        <w:t>23</w:t>
+        <w:t>26</w:t>
       </w:r>
     </w:p>
     <w:p>
@@ -4262,14 +3980,9 @@
         <w:rPr/>
       </w:pPr>
       <w:r>
-        <w:rPr>
-          <w:rFonts w:eastAsia="Times New Roman" w:cs="Times New Roman"/>
-          <w:sz w:val="22"/>
-          <w:szCs w:val="22"/>
-        </w:rPr>
-        <w:t>Table 4.7: Multi-fault test scenarios</w:t>
+        <w:t>Table 4.6: RCA accuracy and response time of the agent per fault type</w:t>
         <w:tab/>
-        <w:t>24</w:t>
+        <w:t>28</w:t>
       </w:r>
     </w:p>
     <w:p>
@@ -4284,14 +3997,9 @@
         <w:rPr/>
       </w:pPr>
       <w:r>
-        <w:rPr>
-          <w:rFonts w:eastAsia="Times New Roman" w:cs="Times New Roman"/>
-          <w:sz w:val="22"/>
-          <w:szCs w:val="22"/>
-        </w:rPr>
-        <w:t>Table 4.8: Summary of test scenarios and results</w:t>
+        <w:t>Table 4.7: Multi-fault test scenarios</w:t>
         <w:tab/>
-        <w:t>25</w:t>
+        <w:t>29</w:t>
       </w:r>
     </w:p>
     <w:p>
@@ -4306,17 +4014,21 @@
         <w:rPr/>
       </w:pPr>
       <w:r>
-        <w:rPr>
-          <w:rFonts w:eastAsia="Times New Roman" w:cs="Times New Roman"/>
-          <w:sz w:val="22"/>
-          <w:szCs w:val="22"/>
-        </w:rPr>
+        <w:t>Table 4.8: Summary of test scenarios and results</w:t>
+        <w:tab/>
+        <w:t>31</w:t>
+      </w:r>
+    </w:p>
+    <w:p>
+      <w:pPr>
+        <w:pStyle w:val="Normal"/>
+        <w:spacing w:after="80" w:before="0"/>
+        <w:ind w:hanging="1400"/>
+      </w:pPr>
+      <w:r>
         <w:t>Table 4.9: Comparison of existing approaches and this project</w:t>
         <w:tab/>
-        <w:t>26</w:t>
-      </w:r>
-      <w:r>
-        <w:br w:type="page"/>
+        <w:t>32</w:t>
       </w:r>
     </w:p>
     <w:p>
@@ -9683,7 +9395,7 @@
         <w:rPr/>
       </w:pPr>
       <w:r>
-        <w:t>The framework is a three-tier operational pipeline, shown in Figure 3.1. Telemetry is transformed into interface-level features. Tier 1 uses a Random Forest to recognise known fault signatures. A high-confidence Tier 1 alert is escalated directly to Tier 3; a low-confidence or unclassified alert is assessed by Tier 2, an LSTM autoencoder that detects temporal deviations and possible zero-day anomalies. Tier 3 is a LangGraph ReAct agent that gathers evidence with diagnostic tools and produces the incident report. The Streamlit dashboard visualises the live state and supports controlled fault injection.</w:t>
+        <w:t>The framework contains three implemented stages: a Random Forest classifier, an LSTM autoencoder and a LangGraph RCA agent. The reusable TieredTriagePipeline component sends an anomalous Random Forest prediction with probability greater than 0.85 directly to the agent; otherwise it evaluates the LSTM and escalates only an LSTM anomaly. The demonstration backend in demo/live_pipeline.py is deliberately more conservative: it displays both detector outputs for a requested replay scenario and invokes the agent only when the LSTM score crosses its stored threshold. These are two code paths in the repository and are described separately to avoid overstating a single routing rule.</w:t>
       </w:r>
     </w:p>
     <w:p>
@@ -11872,7 +11584,7 @@
         <w:rPr/>
       </w:pPr>
       <w:r>
-        <w:t>Tier 1 is a binary Random Forest classifier that distinguishes normal telemetry from anomalous telemetry. The baseline implementation uses 200 estimators, balanced class weights and SMOTE when the minority class has sufficient samples. The Mininet fine-tuning workflow applies a separate calibrated probability threshold and controlled oversampling.</w:t>
+        <w:t>The generic baseline Random Forest in detection/baseline_models.py is binary and uses 200 estimators, balanced class weights and optional SMOTE when enough minority examples are present. The final Mininet fine-tuning workflow is separate: emulation/finetune_on_mininet.py creates a 500-tree RandomForestClassifier, applies controlled SMOTE, learns a validation-set decision threshold and saves a model bundle. The final Mininet values reported in Chapter 4 therefore describe this fine-tuned 500-tree workflow, not the generic baseline class.</w:t>
       </w:r>
     </w:p>
     <w:p>
@@ -12043,7 +11755,7 @@
         <w:rPr/>
       </w:pPr>
       <w:r>
-        <w:t>Tier 2 is a PyTorch LSTM encoder-decoder with a temporal-attention layer. Its default input is a 10-step sequence; each sequence is built separately for a device/interface pair so history cannot leak across interfaces. The model uses 128- and 64-unit encoder LSTMs, a 32-unit bottleneck, and a 128-unit decoder. It is trained on normal windows and assigns a domain-weighted reconstruction error to each window.</w:t>
+        <w:t>The source LSTMAutoencoder class is a PyTorch encoder-decoder: input features pass through 128-unit and 64-unit LSTM encoder layers, temporal attention produces a 64-unit context vector, a 32-unit dense bottleneck compresses it, and 64-unit/128-unit decoder layers reconstruct the sequence. LSTMAutoencoderDetector uses a 10-step interface-isolated window, up to 60 epochs and batch size 128 by default; the Mininet fine-tuning script instantiates the detector with a 10-step window and 50 epochs. The stored model artifact and the feature dimension determine the exact trained instance used at runtime.</w:t>
       </w:r>
     </w:p>
     <w:p>
@@ -12301,14 +12013,7 @@
               <w:rPr/>
             </w:pPr>
             <w:r>
-              <w:rPr>
-                <w:rFonts w:eastAsia="Times New Roman" w:cs="Times New Roman"/>
-                <w:b/>
-                <w:bCs/>
-                <w:sz w:val="20"/>
-                <w:szCs w:val="20"/>
-              </w:rPr>
-              <w:t>Tier 1 (Random Forest)</w:t>
+              <w:t>Tier 1 path</w:t>
             </w:r>
           </w:p>
         </w:tc>
@@ -12332,13 +12037,6 @@
               <w:rPr/>
             </w:pPr>
             <w:r>
-              <w:rPr>
-                <w:rFonts w:eastAsia="Times New Roman" w:cs="Times New Roman"/>
-                <w:b/>
-                <w:bCs/>
-                <w:sz w:val="20"/>
-                <w:szCs w:val="20"/>
-              </w:rPr>
               <w:t>Tier 2 / Tier 3</w:t>
             </w:r>
           </w:p>
@@ -12363,13 +12061,6 @@
               <w:rPr/>
             </w:pPr>
             <w:r>
-              <w:rPr>
-                <w:rFonts w:eastAsia="Times New Roman" w:cs="Times New Roman"/>
-                <w:b/>
-                <w:bCs/>
-                <w:sz w:val="20"/>
-                <w:szCs w:val="20"/>
-              </w:rPr>
               <w:t>Outcome</w:t>
             </w:r>
           </w:p>
@@ -12398,12 +12089,7 @@
               <w:rPr/>
             </w:pPr>
             <w:r>
-              <w:rPr>
-                <w:rFonts w:eastAsia="Times New Roman" w:cs="Times New Roman"/>
-                <w:sz w:val="20"/>
-                <w:szCs w:val="20"/>
-              </w:rPr>
-              <w:t>Not flagged</w:t>
+              <w:t>TieredTriagePipeline: anomalous RF probability &gt; 0.85</w:t>
             </w:r>
           </w:p>
         </w:tc>
@@ -12426,12 +12112,7 @@
               <w:rPr/>
             </w:pPr>
             <w:r>
-              <w:rPr>
-                <w:rFonts w:eastAsia="Times New Roman" w:cs="Times New Roman"/>
-                <w:sz w:val="20"/>
-                <w:szCs w:val="20"/>
-              </w:rPr>
-              <w:t>Not evaluated</w:t>
+              <w:t>LSTM skipped; agent invoked</w:t>
             </w:r>
           </w:p>
         </w:tc>
@@ -12454,12 +12135,7 @@
               <w:rPr/>
             </w:pPr>
             <w:r>
-              <w:rPr>
-                <w:rFonts w:eastAsia="Times New Roman" w:cs="Times New Roman"/>
-                <w:sz w:val="20"/>
-                <w:szCs w:val="20"/>
-              </w:rPr>
-              <w:t>Normal. The LSTM is not consulted and no alert is raised.</w:t>
+              <w:t>High-confidence known anomaly is investigated by the agent.</w:t>
             </w:r>
           </w:p>
         </w:tc>
@@ -12487,12 +12163,7 @@
               <w:rPr/>
             </w:pPr>
             <w:r>
-              <w:rPr>
-                <w:rFonts w:eastAsia="Times New Roman" w:cs="Times New Roman"/>
-                <w:sz w:val="20"/>
-                <w:szCs w:val="20"/>
-              </w:rPr>
-              <w:t>Flagged (known signature)</w:t>
+              <w:t>TieredTriagePipeline: no high-confidence RF anomaly</w:t>
             </w:r>
           </w:p>
         </w:tc>
@@ -12515,12 +12186,7 @@
               <w:rPr/>
             </w:pPr>
             <w:r>
-              <w:rPr>
-                <w:rFonts w:eastAsia="Times New Roman" w:cs="Times New Roman"/>
-                <w:sz w:val="20"/>
-                <w:szCs w:val="20"/>
-              </w:rPr>
-              <w:t>Reconstruction error below threshold</w:t>
+              <w:t>LSTM score at or above calibrated threshold</w:t>
             </w:r>
           </w:p>
         </w:tc>
@@ -12543,12 +12209,7 @@
               <w:rPr/>
             </w:pPr>
             <w:r>
-              <w:rPr>
-                <w:rFonts w:eastAsia="Times New Roman" w:cs="Times New Roman"/>
-                <w:sz w:val="20"/>
-                <w:szCs w:val="20"/>
-              </w:rPr>
-              <w:t>Suppressed as a false positive. The agent is not started, which saves LLM cost.</w:t>
+              <w:t>Potential novel/temporal anomaly is investigated by the agent.</w:t>
             </w:r>
           </w:p>
         </w:tc>
@@ -12576,12 +12237,7 @@
               <w:rPr/>
             </w:pPr>
             <w:r>
-              <w:rPr>
-                <w:rFonts w:eastAsia="Times New Roman" w:cs="Times New Roman"/>
-                <w:sz w:val="20"/>
-                <w:szCs w:val="20"/>
-              </w:rPr>
-              <w:t>Flagged (known signature)</w:t>
+              <w:t>TieredTriagePipeline: no high-confidence RF anomaly</w:t>
             </w:r>
           </w:p>
         </w:tc>
@@ -12604,12 +12260,7 @@
               <w:rPr/>
             </w:pPr>
             <w:r>
-              <w:rPr>
-                <w:rFonts w:eastAsia="Times New Roman" w:cs="Times New Roman"/>
-                <w:sz w:val="20"/>
-                <w:szCs w:val="20"/>
-              </w:rPr>
-              <w:t>Reconstruction error above threshold</w:t>
+              <w:t>LSTM score below threshold</w:t>
             </w:r>
           </w:p>
         </w:tc>
@@ -12632,12 +12283,7 @@
               <w:rPr/>
             </w:pPr>
             <w:r>
-              <w:rPr>
-                <w:rFonts w:eastAsia="Times New Roman" w:cs="Times New Roman"/>
-                <w:sz w:val="20"/>
-                <w:szCs w:val="20"/>
-              </w:rPr>
-              <w:t>Confirmed anomaly. The ReAct agent is started.</w:t>
+              <w:t>No escalation.</w:t>
             </w:r>
           </w:p>
         </w:tc>
@@ -12665,12 +12311,7 @@
               <w:rPr/>
             </w:pPr>
             <w:r>
-              <w:rPr>
-                <w:rFonts w:eastAsia="Times New Roman" w:cs="Times New Roman"/>
-                <w:sz w:val="20"/>
-                <w:szCs w:val="20"/>
-              </w:rPr>
-              <w:t>Agent run</w:t>
+              <w:t>Dashboard replay pipeline</w:t>
             </w:r>
           </w:p>
         </w:tc>
@@ -12693,12 +12334,7 @@
               <w:rPr/>
             </w:pPr>
             <w:r>
-              <w:rPr>
-                <w:rFonts w:eastAsia="Times New Roman" w:cs="Times New Roman"/>
-                <w:sz w:val="20"/>
-                <w:szCs w:val="20"/>
-              </w:rPr>
-              <w:t>Tools return no corroborating evidence</w:t>
+              <w:t>RF and LSTM are both evaluated; agent runs only for an LSTM threshold crossing</w:t>
             </w:r>
           </w:p>
         </w:tc>
@@ -12721,12 +12357,7 @@
               <w:rPr/>
             </w:pPr>
             <w:r>
-              <w:rPr>
-                <w:rFonts w:eastAsia="Times New Roman" w:cs="Times New Roman"/>
-                <w:sz w:val="20"/>
-                <w:szCs w:val="20"/>
-              </w:rPr>
-              <w:t>Suppressed. No incident report is raised.</w:t>
+              <w:t>Dashboard presents both detector verdicts before RCA.</w:t>
             </w:r>
           </w:p>
         </w:tc>
@@ -12754,12 +12385,7 @@
               <w:rPr/>
             </w:pPr>
             <w:r>
-              <w:rPr>
-                <w:rFonts w:eastAsia="Times New Roman" w:cs="Times New Roman"/>
-                <w:sz w:val="20"/>
-                <w:szCs w:val="20"/>
-              </w:rPr>
-              <w:t>Agent run</w:t>
+              <w:t>Agent investigation</w:t>
             </w:r>
           </w:p>
         </w:tc>
@@ -12782,12 +12408,7 @@
               <w:rPr/>
             </w:pPr>
             <w:r>
-              <w:rPr>
-                <w:rFonts w:eastAsia="Times New Roman" w:cs="Times New Roman"/>
-                <w:sz w:val="20"/>
-                <w:szCs w:val="20"/>
-              </w:rPr>
-              <w:t>Tools return supporting evidence</w:t>
+              <w:t>Tool evidence conflicts with alert</w:t>
             </w:r>
           </w:p>
         </w:tc>
@@ -12810,12 +12431,7 @@
               <w:rPr/>
             </w:pPr>
             <w:r>
-              <w:rPr>
-                <w:rFonts w:eastAsia="Times New Roman" w:cs="Times New Roman"/>
-                <w:sz w:val="20"/>
-                <w:szCs w:val="20"/>
-              </w:rPr>
-              <w:t>Incident report with evidence chain and remediation is written and shown on the dashboard.</w:t>
+              <w:t>Agent can return FALSE_POSITIVE or another evidence-supported conclusion.</w:t>
             </w:r>
           </w:p>
         </w:tc>
@@ -13018,7 +12634,7 @@
         <w:rPr/>
       </w:pPr>
       <w:r>
-        <w:t>The agent is implemented as a LangGraph state graph with an agent node and a tool node. The model receives the alert context—device, interface, predicted fault type, score, tier and timestamp—then chooses one or more tools. get_metrics returns the current local counters and probe values; query_syslogs searches device events; inspect_topology identifies links, neighbours and capacity; trace_path checks a route end to end; check_routes validates reachability; and get_anomaly_score compares the current reconstruction score with the learned threshold. The graph alternates between model reasoning and tool execution until the model produces its final report or reaches the eight-call budget.</w:t>
+        <w:t>The agent is implemented as a LangGraph state graph with agent and tool nodes. The configuration sets MAX_AGENT_STEPS to 8 graph iterations. A single model response can request more than one tool, so the saved 25-case benchmark can contain more than eight logged tool calls per investigation; its observed mean is 12.24 calls. The agent has six implemented diagnostic tools: get_metrics, inspect_topology, query_syslogs, trace_path, check_routes and get_anomaly_score.</w:t>
       </w:r>
     </w:p>
     <w:p>
@@ -13536,15 +13152,23 @@
         <w:rPr/>
       </w:pPr>
       <w:r>
-        <w:t>The project has two distinct demonstration paths. In replay mode, the Streamlit dashboard button starts demo/inject_fault.py with the --sim option. This does not alter a Linux interface. Instead, it atomically writes the requested fault name to demo/state.json. The live pipeline detects that request, selects labelled rows of the requested fault type from the saved telemetry, prepends recent normal rows as temporal context, runs the Random Forest and LSTM, and writes each verdict and the RCA trajectory back to the same state file. This provides a reproducible presentation on machines where Mininet cannot run.</w:t>
-      </w:r>
-    </w:p>
-    <w:p>
-      <w:pPr>
-        <w:pStyle w:val="Normal"/>
-      </w:pPr>
-      <w:r>
-        <w:t>In live Mininet mode, the collector and the non-simulation injector execute the actual Linux or Mininet operations listed in Table 3.2. Link failure changes a virtual-link state; congestion and packet loss attach Linux traffic-control queuing disciplines; interface flap repeatedly toggles link state; and MTU mismatch changes the port MTU. Recovery removes traffic-control disciplines, restores UP state and resets MTU to 1500 bytes. In both modes, the dashboard displays a request, detector output and RCA report, but only live Mininet mode changes the emulated network itself.</w:t>
+        <w:t>The project has two distinct demonstration paths. The Streamlit dashboard always starts demo/inject_fault.py with the --sim flag. This is replay mode: the helper atomically writes the requested fault name to demo/state.json, the pipeline selects saved labelled telemetry for that fault, prepends recent normal context and runs the models. It does not modify a Linux interface or a running Mininet topology. This makes the dashboard demonstration reproducible on machines that cannot create network namespaces.</w:t>
+      </w:r>
+    </w:p>
+    <w:p>
+      <w:pPr>
+        <w:pStyle w:val="Normal"/>
+      </w:pPr>
+      <w:r>
+        <w:t>Live Mininet collection is implemented separately in emulation/mininet_topo.py. That module is the authoritative physical fault-injection workflow: it uses net.configLinkStatus for link failure and interface flap, tc netem delay/loss for congestion and packet loss, and ip link set dev &lt;interface&gt; mtu 500 for MTU mismatch. The standalone non-simulation helper contains earlier interface names and alternative command values, including an s1-eth5 MTU command that does not match the current four-leaf topology; it is not the path called by the dashboard. Consequently, the report attributes real-emulation results only to the current Mininet collector workflow, while dashboard screenshots document replay behaviour.</w:t>
+      </w:r>
+    </w:p>
+    <w:p>
+      <w:pPr>
+        <w:pStyle w:val="Normal"/>
+      </w:pPr>
+      <w:r>
+        <w:t>The dashboard interface itself contains four implemented pages: Live Monitor, Telemetry Analytics, Benchmark and Mininet Real-Data Lab. Some dashboard cards use fixed display constants that were current when the user interface was written. Tables in this report use the structured JSON artifacts in results/ as the authoritative source for quantitative claims; screenshots are included as interface evidence rather than a second numerical source.</w:t>
       </w:r>
     </w:p>
     <w:tbl>
@@ -14245,7 +13869,7 @@
               <w:rPr/>
             </w:pPr>
             <w:r>
-              <w:t>Binary detector; 200 estimators; balanced class weights; SMOTE when feasible; calibrated bundle threshold for Mininet.</w:t>
+              <w:t>Generic baseline: 200 trees and balanced weights; Mininet fine-tuning: 500 trees, controlled SMOTE and validation-derived threshold.</w:t>
             </w:r>
           </w:p>
         </w:tc>
@@ -14296,7 +13920,7 @@
               <w:rPr/>
             </w:pPr>
             <w:r>
-              <w:t>128/64 encoder, temporal attention, 32-unit bottleneck, 10-step interface-isolated windows, weighted MSE and median smoothing.</w:t>
+              <w:t>10-step interface-isolated windows; source architecture 128/64 encoder, temporal attention, 32-unit bottleneck, 64/128 decoder; weighted MSE and median smoothing.</w:t>
             </w:r>
           </w:p>
         </w:tc>
@@ -14347,7 +13971,7 @@
               <w:rPr/>
             </w:pPr>
             <w:r>
-              <w:t>LangGraph agent/tool graph; up to 8 tool calls; six diagnostic tools; fallback RCA templates for unavailable LLM service.</w:t>
+              <w:t>LangGraph agent/tool graph; MAX_AGENT_STEPS=8 graph iterations; six diagnostic tools; logged tool-call count may exceed eight when a response requests multiple tools.</w:t>
             </w:r>
           </w:p>
         </w:tc>
@@ -23231,6 +22855,697 @@
       </w:r>
       <w:r>
         <w:br w:type="page"/>
+      </w:r>
+    </w:p>
+    <w:p>
+      <w:pPr>
+        <w:pStyle w:val="Heading1"/>
+      </w:pPr>
+      <w:r>
+        <w:br w:type="page"/>
+      </w:r>
+      <w:r>
+        <w:t>Appendix 3: Dashboard and Evaluation Evidence</w:t>
+      </w:r>
+    </w:p>
+    <w:p>
+      <w:pPr>
+        <w:pStyle w:val="Normal"/>
+      </w:pPr>
+      <w:r>
+        <w:t>This appendix retains every supplied dashboard screenshot and every generated image from the results directory. The captions identify the interface or evaluation context; numerical conclusions in the body remain sourced from the structured result artifacts.</w:t>
+      </w:r>
+    </w:p>
+    <w:p>
+      <w:pPr>
+        <w:pStyle w:val="Normal"/>
+      </w:pPr>
+      <w:r>
+        <w:t>Figure A3.1: Root-cause evidence chain continuation</w:t>
+      </w:r>
+    </w:p>
+    <w:p>
+      <w:pPr>
+        <w:pStyle w:val="Normal"/>
+        <w:jc w:val="center"/>
+      </w:pPr>
+      <w:r>
+        <w:drawing>
+          <wp:inline xmlns:a="http://schemas.openxmlformats.org/drawingml/2006/main">
+            <wp:extent cx="5486400" cy="2978563"/>
+            <wp:docPr id="21" name="Picture 21"/>
+            <wp:cNvGraphicFramePr>
+              <a:graphicFrameLocks noChangeAspect="1"/>
+            </wp:cNvGraphicFramePr>
+            <a:graphic>
+              <a:graphicData uri="http://schemas.openxmlformats.org/drawingml/2006/picture">
+                <pic:pic>
+                  <pic:nvPicPr>
+                    <pic:cNvPr id="0" name="dashboard_live_monitor_RCA_part4.png"/>
+                    <pic:cNvPicPr/>
+                  </pic:nvPicPr>
+                  <pic:blipFill>
+                    <a:blip r:embed="rId31"/>
+                    <a:stretch>
+                      <a:fillRect/>
+                    </a:stretch>
+                  </pic:blipFill>
+                  <pic:spPr>
+                    <a:xfrm>
+                      <a:off x="0" y="0"/>
+                      <a:ext cx="5486400" cy="2978563"/>
+                    </a:xfrm>
+                    <a:prstGeom prst="rect"/>
+                  </pic:spPr>
+                </pic:pic>
+              </a:graphicData>
+            </a:graphic>
+          </wp:inline>
+        </w:drawing>
+      </w:r>
+    </w:p>
+    <w:p>
+      <w:pPr>
+        <w:pStyle w:val="Normal"/>
+      </w:pPr>
+      <w:r>
+        <w:t>Figure A3.2: Root-cause remediation recommendations</w:t>
+      </w:r>
+    </w:p>
+    <w:p>
+      <w:pPr>
+        <w:pStyle w:val="Normal"/>
+        <w:jc w:val="center"/>
+      </w:pPr>
+      <w:r>
+        <w:drawing>
+          <wp:inline xmlns:a="http://schemas.openxmlformats.org/drawingml/2006/main">
+            <wp:extent cx="5486400" cy="5783191"/>
+            <wp:docPr id="22" name="Picture 22"/>
+            <wp:cNvGraphicFramePr>
+              <a:graphicFrameLocks noChangeAspect="1"/>
+            </wp:cNvGraphicFramePr>
+            <a:graphic>
+              <a:graphicData uri="http://schemas.openxmlformats.org/drawingml/2006/picture">
+                <pic:pic>
+                  <pic:nvPicPr>
+                    <pic:cNvPr id="0" name="dashboard_live_monitor_RCA_part5.png"/>
+                    <pic:cNvPicPr/>
+                  </pic:nvPicPr>
+                  <pic:blipFill>
+                    <a:blip r:embed="rId32"/>
+                    <a:stretch>
+                      <a:fillRect/>
+                    </a:stretch>
+                  </pic:blipFill>
+                  <pic:spPr>
+                    <a:xfrm>
+                      <a:off x="0" y="0"/>
+                      <a:ext cx="5486400" cy="5783191"/>
+                    </a:xfrm>
+                    <a:prstGeom prst="rect"/>
+                  </pic:spPr>
+                </pic:pic>
+              </a:graphicData>
+            </a:graphic>
+          </wp:inline>
+        </w:drawing>
+      </w:r>
+    </w:p>
+    <w:p>
+      <w:pPr>
+        <w:pStyle w:val="Normal"/>
+      </w:pPr>
+      <w:r>
+        <w:t>Figure A3.3: Root-cause long-term remediation recommendations</w:t>
+      </w:r>
+    </w:p>
+    <w:p>
+      <w:pPr>
+        <w:pStyle w:val="Normal"/>
+        <w:jc w:val="center"/>
+      </w:pPr>
+      <w:r>
+        <w:drawing>
+          <wp:inline xmlns:a="http://schemas.openxmlformats.org/drawingml/2006/main">
+            <wp:extent cx="5486400" cy="3967089"/>
+            <wp:docPr id="23" name="Picture 23"/>
+            <wp:cNvGraphicFramePr>
+              <a:graphicFrameLocks noChangeAspect="1"/>
+            </wp:cNvGraphicFramePr>
+            <a:graphic>
+              <a:graphicData uri="http://schemas.openxmlformats.org/drawingml/2006/picture">
+                <pic:pic>
+                  <pic:nvPicPr>
+                    <pic:cNvPr id="0" name="dashboard_live_monitor_RCA_part6.png"/>
+                    <pic:cNvPicPr/>
+                  </pic:nvPicPr>
+                  <pic:blipFill>
+                    <a:blip r:embed="rId33"/>
+                    <a:stretch>
+                      <a:fillRect/>
+                    </a:stretch>
+                  </pic:blipFill>
+                  <pic:spPr>
+                    <a:xfrm>
+                      <a:off x="0" y="0"/>
+                      <a:ext cx="5486400" cy="3967089"/>
+                    </a:xfrm>
+                    <a:prstGeom prst="rect"/>
+                  </pic:spPr>
+                </pic:pic>
+              </a:graphicData>
+            </a:graphic>
+          </wp:inline>
+        </w:drawing>
+      </w:r>
+    </w:p>
+    <w:p>
+      <w:pPr>
+        <w:pStyle w:val="Normal"/>
+      </w:pPr>
+      <w:r>
+        <w:t>Figure A3.4: Root-cause confidence assessment</w:t>
+      </w:r>
+    </w:p>
+    <w:p>
+      <w:pPr>
+        <w:pStyle w:val="Normal"/>
+        <w:jc w:val="center"/>
+      </w:pPr>
+      <w:r>
+        <w:drawing>
+          <wp:inline xmlns:a="http://schemas.openxmlformats.org/drawingml/2006/main">
+            <wp:extent cx="5486400" cy="4959178"/>
+            <wp:docPr id="24" name="Picture 24"/>
+            <wp:cNvGraphicFramePr>
+              <a:graphicFrameLocks noChangeAspect="1"/>
+            </wp:cNvGraphicFramePr>
+            <a:graphic>
+              <a:graphicData uri="http://schemas.openxmlformats.org/drawingml/2006/picture">
+                <pic:pic>
+                  <pic:nvPicPr>
+                    <pic:cNvPr id="0" name="dashboard_live_monitor_RCA_part7.png"/>
+                    <pic:cNvPicPr/>
+                  </pic:nvPicPr>
+                  <pic:blipFill>
+                    <a:blip r:embed="rId34"/>
+                    <a:stretch>
+                      <a:fillRect/>
+                    </a:stretch>
+                  </pic:blipFill>
+                  <pic:spPr>
+                    <a:xfrm>
+                      <a:off x="0" y="0"/>
+                      <a:ext cx="5486400" cy="4959178"/>
+                    </a:xfrm>
+                    <a:prstGeom prst="rect"/>
+                  </pic:spPr>
+                </pic:pic>
+              </a:graphicData>
+            </a:graphic>
+          </wp:inline>
+        </w:drawing>
+      </w:r>
+    </w:p>
+    <w:p>
+      <w:pPr>
+        <w:pStyle w:val="Normal"/>
+      </w:pPr>
+      <w:r>
+        <w:t>Figure A3.5: Root-cause tool-evidence analysis panel</w:t>
+      </w:r>
+    </w:p>
+    <w:p>
+      <w:pPr>
+        <w:pStyle w:val="Normal"/>
+        <w:jc w:val="center"/>
+      </w:pPr>
+      <w:r>
+        <w:drawing>
+          <wp:inline xmlns:a="http://schemas.openxmlformats.org/drawingml/2006/main">
+            <wp:extent cx="5486400" cy="3450987"/>
+            <wp:docPr id="25" name="Picture 25"/>
+            <wp:cNvGraphicFramePr>
+              <a:graphicFrameLocks noChangeAspect="1"/>
+            </wp:cNvGraphicFramePr>
+            <a:graphic>
+              <a:graphicData uri="http://schemas.openxmlformats.org/drawingml/2006/picture">
+                <pic:pic>
+                  <pic:nvPicPr>
+                    <pic:cNvPr id="0" name="dashboard_live_monitor_RCA_part8.png"/>
+                    <pic:cNvPicPr/>
+                  </pic:nvPicPr>
+                  <pic:blipFill>
+                    <a:blip r:embed="rId35"/>
+                    <a:stretch>
+                      <a:fillRect/>
+                    </a:stretch>
+                  </pic:blipFill>
+                  <pic:spPr>
+                    <a:xfrm>
+                      <a:off x="0" y="0"/>
+                      <a:ext cx="5486400" cy="3450987"/>
+                    </a:xfrm>
+                    <a:prstGeom prst="rect"/>
+                  </pic:spPr>
+                </pic:pic>
+              </a:graphicData>
+            </a:graphic>
+          </wp:inline>
+        </w:drawing>
+      </w:r>
+    </w:p>
+    <w:p>
+      <w:pPr>
+        <w:pStyle w:val="Normal"/>
+      </w:pPr>
+      <w:r>
+        <w:t>Figure A3.6: Root-cause discarded-hypotheses panel</w:t>
+      </w:r>
+    </w:p>
+    <w:p>
+      <w:pPr>
+        <w:pStyle w:val="Normal"/>
+        <w:jc w:val="center"/>
+      </w:pPr>
+      <w:r>
+        <w:drawing>
+          <wp:inline xmlns:a="http://schemas.openxmlformats.org/drawingml/2006/main">
+            <wp:extent cx="5486400" cy="3224391"/>
+            <wp:docPr id="26" name="Picture 26"/>
+            <wp:cNvGraphicFramePr>
+              <a:graphicFrameLocks noChangeAspect="1"/>
+            </wp:cNvGraphicFramePr>
+            <a:graphic>
+              <a:graphicData uri="http://schemas.openxmlformats.org/drawingml/2006/picture">
+                <pic:pic>
+                  <pic:nvPicPr>
+                    <pic:cNvPr id="0" name="dashboard_live_monitor_RCA_part9.png"/>
+                    <pic:cNvPicPr/>
+                  </pic:nvPicPr>
+                  <pic:blipFill>
+                    <a:blip r:embed="rId36"/>
+                    <a:stretch>
+                      <a:fillRect/>
+                    </a:stretch>
+                  </pic:blipFill>
+                  <pic:spPr>
+                    <a:xfrm>
+                      <a:off x="0" y="0"/>
+                      <a:ext cx="5486400" cy="3224391"/>
+                    </a:xfrm>
+                    <a:prstGeom prst="rect"/>
+                  </pic:spPr>
+                </pic:pic>
+              </a:graphicData>
+            </a:graphic>
+          </wp:inline>
+        </w:drawing>
+      </w:r>
+    </w:p>
+    <w:p>
+      <w:pPr>
+        <w:pStyle w:val="Normal"/>
+      </w:pPr>
+      <w:r>
+        <w:t>Figure A3.7: Telemetry Analytics dashboard overview</w:t>
+      </w:r>
+    </w:p>
+    <w:p>
+      <w:pPr>
+        <w:pStyle w:val="Normal"/>
+        <w:jc w:val="center"/>
+      </w:pPr>
+      <w:r>
+        <w:drawing>
+          <wp:inline xmlns:a="http://schemas.openxmlformats.org/drawingml/2006/main">
+            <wp:extent cx="5486400" cy="2420257"/>
+            <wp:docPr id="27" name="Picture 27"/>
+            <wp:cNvGraphicFramePr>
+              <a:graphicFrameLocks noChangeAspect="1"/>
+            </wp:cNvGraphicFramePr>
+            <a:graphic>
+              <a:graphicData uri="http://schemas.openxmlformats.org/drawingml/2006/picture">
+                <pic:pic>
+                  <pic:nvPicPr>
+                    <pic:cNvPr id="0" name="dashboard_telemetry_analytics_part1.png"/>
+                    <pic:cNvPicPr/>
+                  </pic:nvPicPr>
+                  <pic:blipFill>
+                    <a:blip r:embed="rId37"/>
+                    <a:stretch>
+                      <a:fillRect/>
+                    </a:stretch>
+                  </pic:blipFill>
+                  <pic:spPr>
+                    <a:xfrm>
+                      <a:off x="0" y="0"/>
+                      <a:ext cx="5486400" cy="2420257"/>
+                    </a:xfrm>
+                    <a:prstGeom prst="rect"/>
+                  </pic:spPr>
+                </pic:pic>
+              </a:graphicData>
+            </a:graphic>
+          </wp:inline>
+        </w:drawing>
+      </w:r>
+    </w:p>
+    <w:p>
+      <w:pPr>
+        <w:pStyle w:val="Normal"/>
+      </w:pPr>
+      <w:r>
+        <w:t>Figure A3.8: Telemetry Analytics fault-distribution and metric panels</w:t>
+      </w:r>
+    </w:p>
+    <w:p>
+      <w:pPr>
+        <w:pStyle w:val="Normal"/>
+        <w:jc w:val="center"/>
+      </w:pPr>
+      <w:r>
+        <w:drawing>
+          <wp:inline xmlns:a="http://schemas.openxmlformats.org/drawingml/2006/main">
+            <wp:extent cx="5486400" cy="2997952"/>
+            <wp:docPr id="28" name="Picture 28"/>
+            <wp:cNvGraphicFramePr>
+              <a:graphicFrameLocks noChangeAspect="1"/>
+            </wp:cNvGraphicFramePr>
+            <a:graphic>
+              <a:graphicData uri="http://schemas.openxmlformats.org/drawingml/2006/picture">
+                <pic:pic>
+                  <pic:nvPicPr>
+                    <pic:cNvPr id="0" name="dashboard_telemetry_analytics_part2.png"/>
+                    <pic:cNvPicPr/>
+                  </pic:nvPicPr>
+                  <pic:blipFill>
+                    <a:blip r:embed="rId38"/>
+                    <a:stretch>
+                      <a:fillRect/>
+                    </a:stretch>
+                  </pic:blipFill>
+                  <pic:spPr>
+                    <a:xfrm>
+                      <a:off x="0" y="0"/>
+                      <a:ext cx="5486400" cy="2997952"/>
+                    </a:xfrm>
+                    <a:prstGeom prst="rect"/>
+                  </pic:spPr>
+                </pic:pic>
+              </a:graphicData>
+            </a:graphic>
+          </wp:inline>
+        </w:drawing>
+      </w:r>
+    </w:p>
+    <w:p>
+      <w:pPr>
+        <w:pStyle w:val="Normal"/>
+      </w:pPr>
+      <w:r>
+        <w:t>Figure A3.9: Telemetry Analytics anomaly and feature views</w:t>
+      </w:r>
+    </w:p>
+    <w:p>
+      <w:pPr>
+        <w:pStyle w:val="Normal"/>
+        <w:jc w:val="center"/>
+      </w:pPr>
+      <w:r>
+        <w:drawing>
+          <wp:inline xmlns:a="http://schemas.openxmlformats.org/drawingml/2006/main">
+            <wp:extent cx="5486400" cy="1346356"/>
+            <wp:docPr id="29" name="Picture 29"/>
+            <wp:cNvGraphicFramePr>
+              <a:graphicFrameLocks noChangeAspect="1"/>
+            </wp:cNvGraphicFramePr>
+            <a:graphic>
+              <a:graphicData uri="http://schemas.openxmlformats.org/drawingml/2006/picture">
+                <pic:pic>
+                  <pic:nvPicPr>
+                    <pic:cNvPr id="0" name="dashboard_telemetry_analytics_part3.png"/>
+                    <pic:cNvPicPr/>
+                  </pic:nvPicPr>
+                  <pic:blipFill>
+                    <a:blip r:embed="rId39"/>
+                    <a:stretch>
+                      <a:fillRect/>
+                    </a:stretch>
+                  </pic:blipFill>
+                  <pic:spPr>
+                    <a:xfrm>
+                      <a:off x="0" y="0"/>
+                      <a:ext cx="5486400" cy="1346356"/>
+                    </a:xfrm>
+                    <a:prstGeom prst="rect"/>
+                  </pic:spPr>
+                </pic:pic>
+              </a:graphicData>
+            </a:graphic>
+          </wp:inline>
+        </w:drawing>
+      </w:r>
+    </w:p>
+    <w:p>
+      <w:pPr>
+        <w:pStyle w:val="Normal"/>
+      </w:pPr>
+      <w:r>
+        <w:t>Figure A3.10: Benchmark dashboard summary cards</w:t>
+      </w:r>
+    </w:p>
+    <w:p>
+      <w:pPr>
+        <w:pStyle w:val="Normal"/>
+        <w:jc w:val="center"/>
+      </w:pPr>
+      <w:r>
+        <w:drawing>
+          <wp:inline xmlns:a="http://schemas.openxmlformats.org/drawingml/2006/main">
+            <wp:extent cx="5486400" cy="2523176"/>
+            <wp:docPr id="30" name="Picture 30"/>
+            <wp:cNvGraphicFramePr>
+              <a:graphicFrameLocks noChangeAspect="1"/>
+            </wp:cNvGraphicFramePr>
+            <a:graphic>
+              <a:graphicData uri="http://schemas.openxmlformats.org/drawingml/2006/picture">
+                <pic:pic>
+                  <pic:nvPicPr>
+                    <pic:cNvPr id="0" name="dashboard_benchmark_part1.png"/>
+                    <pic:cNvPicPr/>
+                  </pic:nvPicPr>
+                  <pic:blipFill>
+                    <a:blip r:embed="rId40"/>
+                    <a:stretch>
+                      <a:fillRect/>
+                    </a:stretch>
+                  </pic:blipFill>
+                  <pic:spPr>
+                    <a:xfrm>
+                      <a:off x="0" y="0"/>
+                      <a:ext cx="5486400" cy="2523176"/>
+                    </a:xfrm>
+                    <a:prstGeom prst="rect"/>
+                  </pic:spPr>
+                </pic:pic>
+              </a:graphicData>
+            </a:graphic>
+          </wp:inline>
+        </w:drawing>
+      </w:r>
+    </w:p>
+    <w:p>
+      <w:pPr>
+        <w:pStyle w:val="Normal"/>
+      </w:pPr>
+      <w:r>
+        <w:t>Figure A3.11: Benchmark dashboard detailed scenario table</w:t>
+      </w:r>
+    </w:p>
+    <w:p>
+      <w:pPr>
+        <w:pStyle w:val="Normal"/>
+        <w:jc w:val="center"/>
+      </w:pPr>
+      <w:r>
+        <w:drawing>
+          <wp:inline xmlns:a="http://schemas.openxmlformats.org/drawingml/2006/main">
+            <wp:extent cx="5486400" cy="3070439"/>
+            <wp:docPr id="31" name="Picture 31"/>
+            <wp:cNvGraphicFramePr>
+              <a:graphicFrameLocks noChangeAspect="1"/>
+            </wp:cNvGraphicFramePr>
+            <a:graphic>
+              <a:graphicData uri="http://schemas.openxmlformats.org/drawingml/2006/picture">
+                <pic:pic>
+                  <pic:nvPicPr>
+                    <pic:cNvPr id="0" name="dashboard_benchmark_part2.png"/>
+                    <pic:cNvPicPr/>
+                  </pic:nvPicPr>
+                  <pic:blipFill>
+                    <a:blip r:embed="rId41"/>
+                    <a:stretch>
+                      <a:fillRect/>
+                    </a:stretch>
+                  </pic:blipFill>
+                  <pic:spPr>
+                    <a:xfrm>
+                      <a:off x="0" y="0"/>
+                      <a:ext cx="5486400" cy="3070439"/>
+                    </a:xfrm>
+                    <a:prstGeom prst="rect"/>
+                  </pic:spPr>
+                </pic:pic>
+              </a:graphicData>
+            </a:graphic>
+          </wp:inline>
+        </w:drawing>
+      </w:r>
+    </w:p>
+    <w:p>
+      <w:pPr>
+        <w:pStyle w:val="Normal"/>
+      </w:pPr>
+      <w:r>
+        <w:t>Figure A3.12: Results-folder confusion matrices</w:t>
+      </w:r>
+    </w:p>
+    <w:p>
+      <w:pPr>
+        <w:pStyle w:val="Normal"/>
+        <w:jc w:val="center"/>
+      </w:pPr>
+      <w:r>
+        <w:drawing>
+          <wp:inline xmlns:a="http://schemas.openxmlformats.org/drawingml/2006/main">
+            <wp:extent cx="5486400" cy="1436038"/>
+            <wp:docPr id="32" name="Picture 32"/>
+            <wp:cNvGraphicFramePr>
+              <a:graphicFrameLocks noChangeAspect="1"/>
+            </wp:cNvGraphicFramePr>
+            <a:graphic>
+              <a:graphicData uri="http://schemas.openxmlformats.org/drawingml/2006/picture">
+                <pic:pic>
+                  <pic:nvPicPr>
+                    <pic:cNvPr id="0" name="confusion_matrices.png"/>
+                    <pic:cNvPicPr/>
+                  </pic:nvPicPr>
+                  <pic:blipFill>
+                    <a:blip r:embed="rId42"/>
+                    <a:stretch>
+                      <a:fillRect/>
+                    </a:stretch>
+                  </pic:blipFill>
+                  <pic:spPr>
+                    <a:xfrm>
+                      <a:off x="0" y="0"/>
+                      <a:ext cx="5486400" cy="1436038"/>
+                    </a:xfrm>
+                    <a:prstGeom prst="rect"/>
+                  </pic:spPr>
+                </pic:pic>
+              </a:graphicData>
+            </a:graphic>
+          </wp:inline>
+        </w:drawing>
+      </w:r>
+    </w:p>
+    <w:p>
+      <w:pPr>
+        <w:pStyle w:val="Normal"/>
+      </w:pPr>
+      <w:r>
+        <w:t>Figure A3.13: Results-folder ROC and precision-recall curves</w:t>
+      </w:r>
+    </w:p>
+    <w:p>
+      <w:pPr>
+        <w:pStyle w:val="Normal"/>
+        <w:jc w:val="center"/>
+      </w:pPr>
+      <w:r>
+        <w:drawing>
+          <wp:inline xmlns:a="http://schemas.openxmlformats.org/drawingml/2006/main">
+            <wp:extent cx="5486400" cy="4267200"/>
+            <wp:docPr id="33" name="Picture 33"/>
+            <wp:cNvGraphicFramePr>
+              <a:graphicFrameLocks noChangeAspect="1"/>
+            </wp:cNvGraphicFramePr>
+            <a:graphic>
+              <a:graphicData uri="http://schemas.openxmlformats.org/drawingml/2006/picture">
+                <pic:pic>
+                  <pic:nvPicPr>
+                    <pic:cNvPr id="0" name="roc_curves.png"/>
+                    <pic:cNvPicPr/>
+                  </pic:nvPicPr>
+                  <pic:blipFill>
+                    <a:blip r:embed="rId43"/>
+                    <a:stretch>
+                      <a:fillRect/>
+                    </a:stretch>
+                  </pic:blipFill>
+                  <pic:spPr>
+                    <a:xfrm>
+                      <a:off x="0" y="0"/>
+                      <a:ext cx="5486400" cy="4267200"/>
+                    </a:xfrm>
+                    <a:prstGeom prst="rect"/>
+                  </pic:spPr>
+                </pic:pic>
+              </a:graphicData>
+            </a:graphic>
+          </wp:inline>
+        </w:drawing>
+      </w:r>
+    </w:p>
+    <w:p>
+      <w:pPr>
+        <w:pStyle w:val="Normal"/>
+      </w:pPr>
+      <w:r>
+        <w:t>Figure A3.14: Results-folder threshold-sweep diagnostic</w:t>
+      </w:r>
+    </w:p>
+    <w:p>
+      <w:pPr>
+        <w:pStyle w:val="Normal"/>
+        <w:jc w:val="center"/>
+      </w:pPr>
+      <w:r>
+        <w:drawing>
+          <wp:inline xmlns:a="http://schemas.openxmlformats.org/drawingml/2006/main">
+            <wp:extent cx="5486400" cy="3291840"/>
+            <wp:docPr id="34" name="Picture 34"/>
+            <wp:cNvGraphicFramePr>
+              <a:graphicFrameLocks noChangeAspect="1"/>
+            </wp:cNvGraphicFramePr>
+            <a:graphic>
+              <a:graphicData uri="http://schemas.openxmlformats.org/drawingml/2006/picture">
+                <pic:pic>
+                  <pic:nvPicPr>
+                    <pic:cNvPr id="0" name="threshold_sweep.png"/>
+                    <pic:cNvPicPr/>
+                  </pic:nvPicPr>
+                  <pic:blipFill>
+                    <a:blip r:embed="rId44"/>
+                    <a:stretch>
+                      <a:fillRect/>
+                    </a:stretch>
+                  </pic:blipFill>
+                  <pic:spPr>
+                    <a:xfrm>
+                      <a:off x="0" y="0"/>
+                      <a:ext cx="5486400" cy="3291840"/>
+                    </a:xfrm>
+                    <a:prstGeom prst="rect"/>
+                  </pic:spPr>
+                </pic:pic>
+              </a:graphicData>
+            </a:graphic>
+          </wp:inline>
+        </w:drawing>
       </w:r>
     </w:p>
     <w:p>

</xml_diff>